<commit_message>
Vòng 14: cập nhật bài 19322 đã đăng trực tuyến (chuyển sang Bảng 6)
Co-Authored-By: Claude Opus 5.5 <noreply@anthropic.com>
Claude-Session: https://claude.ai/code/session_012s8WfVyLuhc473yaQuJygq
</commit_message>
<xml_diff>
--- a/outputs/round-14/de-cuong-v14-round-14.docx
+++ b/outputs/round-14/de-cuong-v14-round-14.docx
@@ -5747,7 +5747,7 @@
         <w:pStyle w:val="BodyText"/>
       </w:pPr>
       <w:r>
-        <w:t xml:space="preserve">Thí sinh đã dùng dữ liệu Việt Nam trong bài báo Nguyễn và Nguyễn (2026a) và trong các bản thảo số 5 và số 7 ở Bảng 7 [CẦN XÁC MINH phạm vi sàn của từng bài]. Để kiểm soát rủi ro chọn kết quả sau khi xem dữ liệu, thí sinh đăng ký trước kế hoạch phân tích trên OSF Registries trước ngày 28/12/2026, sau khi xin góp ý của người hướng dẫn dự kiến, và khai rõ phạm vi sàn, giai đoạn và chỉ báo đã tính trong các bài trước.</w:t>
+        <w:t xml:space="preserve">Thí sinh đã dùng dữ liệu Việt Nam trong bài báo Nguyễn và Nguyễn (2026a) và trong các bản thảo số 4 và số 6 ở Bảng 7 [CẦN XÁC MINH phạm vi sàn của từng bài]. Để kiểm soát rủi ro chọn kết quả sau khi xem dữ liệu, thí sinh đăng ký trước kế hoạch phân tích trên OSF Registries trước ngày 28/12/2026, sau khi xin góp ý của người hướng dẫn dự kiến, và khai rõ phạm vi sàn, giai đoạn và chỉ báo đã tính trong các bài trước.</w:t>
       </w:r>
     </w:p>
     <w:p>
@@ -11184,13 +11184,70 @@
           </w:p>
         </w:tc>
       </w:tr>
+      <w:tr>
+        <w:trPr>
+          <w:cantSplit/>
+        </w:trPr>
+        <w:tc>
+          <w:tcPr>
+            <w:tcW w:w="600" w:type="dxa"/>
+          </w:tcPr>
+          <w:p>
+            <w:pPr>
+              <w:pStyle w:val="Compact"/>
+            </w:pPr>
+            <w:r>
+              <w:t xml:space="preserve">4</w:t>
+            </w:r>
+          </w:p>
+        </w:tc>
+        <w:tc>
+          <w:tcPr>
+            <w:tcW w:w="3900" w:type="dxa"/>
+          </w:tcPr>
+          <w:p>
+            <w:pPr>
+              <w:pStyle w:val="Compact"/>
+            </w:pPr>
+            <w:r>
+              <w:t xml:space="preserve">Nguyen Thanh Binh, Nguyen Van Trung*, Nguyen Bach Diep, Ha Hong Hanh, Le Hong Minh, “Portfolio optimization with the inverse Black–Litterman framework and clustering machine-learning models: Evidence from Vietnamese bank stocks”</w:t>
+            </w:r>
+          </w:p>
+        </w:tc>
+        <w:tc>
+          <w:tcPr>
+            <w:tcW w:w="2600" w:type="dxa"/>
+          </w:tcPr>
+          <w:p>
+            <w:pPr>
+              <w:pStyle w:val="Compact"/>
+            </w:pPr>
+            <w:r>
+              <w:t xml:space="preserve">Multidisciplinary Science Journal (Malque Publishing); ISSN 2675-1240; Scopus Q3</w:t>
+            </w:r>
+          </w:p>
+        </w:tc>
+        <w:tc>
+          <w:tcPr>
+            <w:tcW w:w="1688" w:type="dxa"/>
+          </w:tcPr>
+          <w:p>
+            <w:pPr>
+              <w:pStyle w:val="Compact"/>
+            </w:pPr>
+            <w:r>
+              <w:t xml:space="preserve">Đã được chấp nhận đăng, công bố trực tuyến trong mục Accepted Articles ngày 09/10/2026 (mã 19322; https://malque.pub/ojs/index.php/msj/article/view/19322)</w:t>
+            </w:r>
+          </w:p>
+        </w:tc>
+      </w:tr>
     </w:tbl>
     <w:p>
       <w:pPr>
         <w:pStyle w:val="SourceNote"/>
       </w:pPr>
       <w:r>
-        <w:t xml:space="preserve">Ghi chú: (*) Tác giả liên hệ. Tên bài báo bằng tiếng Anh giữ nguyên như khi công bố. Trạng thái tính đến ngày 30/9/2026.</w:t>
+        <w:t xml:space="preserve">Ghi chú: (*) Tác giả liên hệ. Tên bài báo bằng tiếng Anh giữ nguyên như khi công bố. Trạng thái tính đến ngày 30/9/2026; riêng bài số 4 cập nhật đến ngày 09/10/2026.</w:t>
       </w:r>
     </w:p>
     <w:p>
@@ -11198,7 +11255,7 @@
         <w:pStyle w:val="BodyText"/>
       </w:pPr>
       <w:r>
-        <w:t>Ngoài các công trình trên, thí sinh có chín bản thảo đang ở các bước phản biện hoặc xét duyệt (Bảng 7), trong đó ba bản thảo liên quan trực tiếp đến đề tài.</w:t>
+        <w:t xml:space="preserve">Ngoài các công trình trên, thí sinh có tám bản thảo đang ở các bước phản biện hoặc xét duyệt (Bảng 7), trong đó hai bản thảo liên quan trực tiếp đến đề tài.</w:t>
       </w:r>
     </w:p>
     <w:p>
@@ -11341,7 +11398,7 @@
               <w:pStyle w:val="Compact"/>
             </w:pPr>
             <w:r>
-              <w:t>1</w:t>
+              <w:t xml:space="preserve">1</w:t>
             </w:r>
           </w:p>
         </w:tc>
@@ -11354,7 +11411,7 @@
               <w:pStyle w:val="Compact"/>
             </w:pPr>
             <w:r>
-              <w:t>Portfolio optimization with the inverse Black-Litterman framework and clustering machine-learning models: Evidence from Vietnamese bank stocks</w:t>
+              <w:t>Tác động của cấu trúc sở hữu lên ổn định tài chính của các ngân hàng thương mại Việt Nam</w:t>
             </w:r>
           </w:p>
         </w:tc>
@@ -11367,7 +11424,7 @@
               <w:pStyle w:val="Compact"/>
             </w:pPr>
             <w:r>
-              <w:t>5</w:t>
+              <w:t>2</w:t>
             </w:r>
           </w:p>
         </w:tc>
@@ -11380,7 +11437,7 @@
               <w:pStyle w:val="Compact"/>
             </w:pPr>
             <w:r>
-              <w:t>Multidisciplinary Science Journal; ISSN 2675-1240; Scopus Q3</w:t>
+              <w:t>Tạp chí Kinh tế - Luật và Ngân hàng; ISSN 3030-4199</w:t>
             </w:r>
           </w:p>
         </w:tc>
@@ -11393,7 +11450,7 @@
               <w:pStyle w:val="Compact"/>
             </w:pPr>
             <w:r>
-              <w:t>Đã sửa xong vòng 2 (mã 19322)</w:t>
+              <w:t>Qua 2 vòng phản biện, đang chỉnh sửa (mã 3129)</w:t>
             </w:r>
           </w:p>
         </w:tc>
@@ -11406,7 +11463,7 @@
               <w:pStyle w:val="Compact"/>
             </w:pPr>
             <w:r>
-              <w:t>Có (mô hình danh mục)</w:t>
+              <w:t>Không</w:t>
             </w:r>
           </w:p>
         </w:tc>
@@ -11424,7 +11481,7 @@
               <w:pStyle w:val="Compact"/>
             </w:pPr>
             <w:r>
-              <w:t>2</w:t>
+              <w:t xml:space="preserve">2</w:t>
             </w:r>
           </w:p>
         </w:tc>
@@ -11437,7 +11494,7 @@
               <w:pStyle w:val="Compact"/>
             </w:pPr>
             <w:r>
-              <w:t>Tác động của cấu trúc sở hữu lên ổn định tài chính của các ngân hàng thương mại Việt Nam</w:t>
+              <w:t>Limits to arbitrage in the Vietnamese physical gold market: The failure of short-term momentum</w:t>
             </w:r>
           </w:p>
         </w:tc>
@@ -11450,7 +11507,7 @@
               <w:pStyle w:val="Compact"/>
             </w:pPr>
             <w:r>
-              <w:t>2</w:t>
+              <w:t>3</w:t>
             </w:r>
           </w:p>
         </w:tc>
@@ -11463,7 +11520,7 @@
               <w:pStyle w:val="Compact"/>
             </w:pPr>
             <w:r>
-              <w:t>Tạp chí Kinh tế - Luật và Ngân hàng; ISSN 3030-4199</w:t>
+              <w:t>Journal of Economic and Banking Studies; ISSN 2734-9853</w:t>
             </w:r>
           </w:p>
         </w:tc>
@@ -11476,7 +11533,7 @@
               <w:pStyle w:val="Compact"/>
             </w:pPr>
             <w:r>
-              <w:t>Qua 2 vòng phản biện, đang chỉnh sửa (mã 3129)</w:t>
+              <w:t>Đang sửa vòng 1 (mã JEBS.1563)</w:t>
             </w:r>
           </w:p>
         </w:tc>
@@ -11507,7 +11564,7 @@
               <w:pStyle w:val="Compact"/>
             </w:pPr>
             <w:r>
-              <w:t>3</w:t>
+              <w:t xml:space="preserve">3</w:t>
             </w:r>
           </w:p>
         </w:tc>
@@ -11520,7 +11577,7 @@
               <w:pStyle w:val="Compact"/>
             </w:pPr>
             <w:r>
-              <w:t>Limits to arbitrage in the Vietnamese physical gold market: The failure of short-term momentum</w:t>
+              <w:t>Corporate Brownwashing and Firm Valuation in ASEAN-5 Disclosure Regimes</w:t>
             </w:r>
           </w:p>
         </w:tc>
@@ -11533,7 +11590,7 @@
               <w:pStyle w:val="Compact"/>
             </w:pPr>
             <w:r>
-              <w:t>3</w:t>
+              <w:t>2</w:t>
             </w:r>
           </w:p>
         </w:tc>
@@ -11546,7 +11603,7 @@
               <w:pStyle w:val="Compact"/>
             </w:pPr>
             <w:r>
-              <w:t>Journal of Economic and Banking Studies; ISSN 2734-9853</w:t>
+              <w:t>Cogent Business &amp; Management; ISSN 2331-1975; Scopus Q2</w:t>
             </w:r>
           </w:p>
         </w:tc>
@@ -11559,7 +11616,7 @@
               <w:pStyle w:val="Compact"/>
             </w:pPr>
             <w:r>
-              <w:t>Đang sửa vòng 1 (mã JEBS.1563)</w:t>
+              <w:t>Đang phản biện vòng 1 (mã 260865765)</w:t>
             </w:r>
           </w:p>
         </w:tc>
@@ -11590,7 +11647,7 @@
               <w:pStyle w:val="Compact"/>
             </w:pPr>
             <w:r>
-              <w:t>4</w:t>
+              <w:t xml:space="preserve">4</w:t>
             </w:r>
           </w:p>
         </w:tc>
@@ -11603,7 +11660,7 @@
               <w:pStyle w:val="Compact"/>
             </w:pPr>
             <w:r>
-              <w:t>Corporate Brownwashing and Firm Valuation in ASEAN-5 Disclosure Regimes</w:t>
+              <w:t>Structural breaks in Vietnamese stock market liquidity: Evidence from the Amihud illiquidity measure and Bai-Perron regime-shift detection</w:t>
             </w:r>
           </w:p>
         </w:tc>
@@ -11616,7 +11673,7 @@
               <w:pStyle w:val="Compact"/>
             </w:pPr>
             <w:r>
-              <w:t>2</w:t>
+              <w:t>6</w:t>
             </w:r>
           </w:p>
         </w:tc>
@@ -11629,7 +11686,7 @@
               <w:pStyle w:val="Compact"/>
             </w:pPr>
             <w:r>
-              <w:t>Cogent Business &amp; Management; ISSN 2331-1975; Scopus Q2</w:t>
+              <w:t>Asian Journal of Economics and Banking; ISSN 2615-9821</w:t>
             </w:r>
           </w:p>
         </w:tc>
@@ -11642,7 +11699,7 @@
               <w:pStyle w:val="Compact"/>
             </w:pPr>
             <w:r>
-              <w:t>Đang phản biện vòng 1 (mã 260865765)</w:t>
+              <w:t>Chờ phân công phản biện (mã AJEB-08-2026-0208)</w:t>
             </w:r>
           </w:p>
         </w:tc>
@@ -11655,7 +11712,7 @@
               <w:pStyle w:val="Compact"/>
             </w:pPr>
             <w:r>
-              <w:t>Không</w:t>
+              <w:t xml:space="preserve">Có (chỉ báo thanh khoản, điểm gãy)</w:t>
             </w:r>
           </w:p>
         </w:tc>
@@ -11673,7 +11730,7 @@
               <w:pStyle w:val="Compact"/>
             </w:pPr>
             <w:r>
-              <w:t>5</w:t>
+              <w:t xml:space="preserve">5</w:t>
             </w:r>
           </w:p>
         </w:tc>
@@ -11686,7 +11743,7 @@
               <w:pStyle w:val="Compact"/>
             </w:pPr>
             <w:r>
-              <w:t>Structural breaks in Vietnamese stock market liquidity: Evidence from the Amihud illiquidity measure and Bai-Perron regime-shift detection</w:t>
+              <w:t>Nested equity index correlations overstate true co-movement: Evidence from Vietnam</w:t>
             </w:r>
           </w:p>
         </w:tc>
@@ -11699,7 +11756,7 @@
               <w:pStyle w:val="Compact"/>
             </w:pPr>
             <w:r>
-              <w:t>6</w:t>
+              <w:t>4</w:t>
             </w:r>
           </w:p>
         </w:tc>
@@ -11712,7 +11769,7 @@
               <w:pStyle w:val="Compact"/>
             </w:pPr>
             <w:r>
-              <w:t>Asian Journal of Economics and Banking; ISSN 2615-9821</w:t>
+              <w:t>Asia-Pacific Financial Markets; ISSN 1387-2834; Scopus Q2</w:t>
             </w:r>
           </w:p>
         </w:tc>
@@ -11725,7 +11782,7 @@
               <w:pStyle w:val="Compact"/>
             </w:pPr>
             <w:r>
-              <w:t>Chờ phân công phản biện (mã AJEB-08-2026-0208)</w:t>
+              <w:t>Ban biên tập đang xem xét (mã FEJM-D-26-00726)</w:t>
             </w:r>
           </w:p>
         </w:tc>
@@ -11738,7 +11795,7 @@
               <w:pStyle w:val="Compact"/>
             </w:pPr>
             <w:r>
-              <w:t xml:space="preserve">Có (chỉ báo thanh khoản, điểm gãy)</w:t>
+              <w:t xml:space="preserve">Không</w:t>
             </w:r>
           </w:p>
         </w:tc>
@@ -11756,7 +11813,7 @@
               <w:pStyle w:val="Compact"/>
             </w:pPr>
             <w:r>
-              <w:t>6</w:t>
+              <w:t xml:space="preserve">6</w:t>
             </w:r>
           </w:p>
         </w:tc>
@@ -11769,7 +11826,7 @@
               <w:pStyle w:val="Compact"/>
             </w:pPr>
             <w:r>
-              <w:t>Nested equity index correlations overstate true co-movement: Evidence from Vietnam</w:t>
+              <w:t>Who gains from a market upgrade? Stock liquidity and prices around Vietnam’s FTSE Russell reclassification</w:t>
             </w:r>
           </w:p>
         </w:tc>
@@ -11795,7 +11852,7 @@
               <w:pStyle w:val="Compact"/>
             </w:pPr>
             <w:r>
-              <w:t>Asia-Pacific Financial Markets; ISSN 1387-2834; Scopus Q2</w:t>
+              <w:t>Finance Research Open; ISSN 3050-7006</w:t>
             </w:r>
           </w:p>
         </w:tc>
@@ -11808,7 +11865,7 @@
               <w:pStyle w:val="Compact"/>
             </w:pPr>
             <w:r>
-              <w:t>Ban biên tập đang xem xét (mã FEJM-D-26-00726)</w:t>
+              <w:t>Ban biên tập đang xem xét (mã FINR-D-26-00823)</w:t>
             </w:r>
           </w:p>
         </w:tc>
@@ -11821,7 +11878,7 @@
               <w:pStyle w:val="Compact"/>
             </w:pPr>
             <w:r>
-              <w:t xml:space="preserve">Không</w:t>
+              <w:t xml:space="preserve">Có (thanh khoản thị trường)</w:t>
             </w:r>
           </w:p>
         </w:tc>
@@ -11839,7 +11896,7 @@
               <w:pStyle w:val="Compact"/>
             </w:pPr>
             <w:r>
-              <w:t>7</w:t>
+              <w:t xml:space="preserve">7</w:t>
             </w:r>
           </w:p>
         </w:tc>
@@ -11852,7 +11909,7 @@
               <w:pStyle w:val="Compact"/>
             </w:pPr>
             <w:r>
-              <w:t>Who gains from a market upgrade? Stock liquidity and prices around Vietnam’s FTSE Russell reclassification</w:t>
+              <w:t>Rated at the peak? Firm valuation around the first LSEG ESG score in five Southeast Asian markets</w:t>
             </w:r>
           </w:p>
         </w:tc>
@@ -11878,7 +11935,7 @@
               <w:pStyle w:val="Compact"/>
             </w:pPr>
             <w:r>
-              <w:t>Finance Research Open; ISSN 3050-7006</w:t>
+              <w:t>Sustainable Finance Review; ISSN 2977-7542</w:t>
             </w:r>
           </w:p>
         </w:tc>
@@ -11891,7 +11948,7 @@
               <w:pStyle w:val="Compact"/>
             </w:pPr>
             <w:r>
-              <w:t>Ban biên tập đang xem xét (mã FINR-D-26-00823)</w:t>
+              <w:t>Chờ xử lý tại tòa soạn (mã SFR-09-2026-0113)</w:t>
             </w:r>
           </w:p>
         </w:tc>
@@ -11904,7 +11961,7 @@
               <w:pStyle w:val="Compact"/>
             </w:pPr>
             <w:r>
-              <w:t xml:space="preserve">Có (thanh khoản thị trường)</w:t>
+              <w:t>Không</w:t>
             </w:r>
           </w:p>
         </w:tc>
@@ -11922,90 +11979,7 @@
               <w:pStyle w:val="Compact"/>
             </w:pPr>
             <w:r>
-              <w:t>8</w:t>
-            </w:r>
-          </w:p>
-        </w:tc>
-        <w:tc>
-          <w:tcPr>
-            <w:tcW w:w="2900" w:type="dxa"/>
-          </w:tcPr>
-          <w:p>
-            <w:pPr>
-              <w:pStyle w:val="Compact"/>
-            </w:pPr>
-            <w:r>
-              <w:t>Rated at the peak? Firm valuation around the first LSEG ESG score in five Southeast Asian markets</w:t>
-            </w:r>
-          </w:p>
-        </w:tc>
-        <w:tc>
-          <w:tcPr>
-            <w:tcW w:w="800" w:type="dxa"/>
-          </w:tcPr>
-          <w:p>
-            <w:pPr>
-              <w:pStyle w:val="Compact"/>
-            </w:pPr>
-            <w:r>
-              <w:t>4</w:t>
-            </w:r>
-          </w:p>
-        </w:tc>
-        <w:tc>
-          <w:tcPr>
-            <w:tcW w:w="2150" w:type="dxa"/>
-          </w:tcPr>
-          <w:p>
-            <w:pPr>
-              <w:pStyle w:val="Compact"/>
-            </w:pPr>
-            <w:r>
-              <w:t>Sustainable Finance Review; ISSN 2977-7542</w:t>
-            </w:r>
-          </w:p>
-        </w:tc>
-        <w:tc>
-          <w:tcPr>
-            <w:tcW w:w="1500" w:type="dxa"/>
-          </w:tcPr>
-          <w:p>
-            <w:pPr>
-              <w:pStyle w:val="Compact"/>
-            </w:pPr>
-            <w:r>
-              <w:t>Chờ xử lý tại tòa soạn (mã SFR-09-2026-0113)</w:t>
-            </w:r>
-          </w:p>
-        </w:tc>
-        <w:tc>
-          <w:tcPr>
-            <w:tcW w:w="888" w:type="dxa"/>
-          </w:tcPr>
-          <w:p>
-            <w:pPr>
-              <w:pStyle w:val="Compact"/>
-            </w:pPr>
-            <w:r>
-              <w:t>Không</w:t>
-            </w:r>
-          </w:p>
-        </w:tc>
-      </w:tr>
-      <w:tr>
-        <w:trPr>
-          <w:cantSplit/>
-        </w:trPr>
-        <w:tc>
-          <w:tcPr>
-            <w:tcW w:w="550" w:type="dxa"/>
-          </w:tcPr>
-          <w:p>
-            <w:pPr>
-              <w:pStyle w:val="Compact"/>
-            </w:pPr>
-            <w:r>
-              <w:t>9</w:t>
+              <w:t xml:space="preserve">8</w:t>
             </w:r>
           </w:p>
         </w:tc>
@@ -12081,7 +12055,7 @@
         <w:pStyle w:val="SourceNote"/>
       </w:pPr>
       <w:r>
-        <w:t xml:space="preserve">Ghi chú: Thí sinh là tác giả liên hệ của cả chín bản thảo.</w:t>
+        <w:t xml:space="preserve">Ghi chú: Thí sinh là tác giả liên hệ của cả tám bản thảo.</w:t>
       </w:r>
     </w:p>
     <w:p>
@@ -12133,7 +12107,7 @@
         <w:pStyle w:val="BodyText"/>
       </w:pPr>
       <w:r>
-        <w:t xml:space="preserve">Thí sinh chuẩn bị cho đề tài qua các công việc nghiên cứu đã làm. Bản thảo số 7 ở Bảng 7, về thanh khoản cổ phiếu quanh đợt nâng hạng thị trường của FTSE Russell, cho thí sinh kinh nghiệm với nghiên cứu sự kiện trên thanh khoản, công cụ trực tiếp của H</w:t>
+        <w:t xml:space="preserve">Thí sinh chuẩn bị cho đề tài qua các công việc nghiên cứu đã làm. Bản thảo số 6 ở Bảng 7, về thanh khoản cổ phiếu quanh đợt nâng hạng thị trường của FTSE Russell, cho thí sinh kinh nghiệm với nghiên cứu sự kiện trên thanh khoản, công cụ trực tiếp của H</w:t>
       </w:r>
       <w:r>
         <w:rPr>
@@ -12142,7 +12116,7 @@
         <w:t xml:space="preserve">3</w:t>
       </w:r>
       <w:r>
-        <w:t xml:space="preserve">; bản thảo số 5, về điểm gãy cấu trúc của thanh khoản, cho thí sinh kinh nghiệm với độ phi thanh khoản Amihud và phương pháp Bai-Perron. Bài báo Nguyễn và Nguyễn (2026a) là nền của mô hình M</w:t>
+        <w:t xml:space="preserve">; bản thảo số 4, về điểm gãy cấu trúc của thanh khoản, cho thí sinh kinh nghiệm với độ phi thanh khoản Amihud và phương pháp Bai-Perron. Bài báo Nguyễn và Nguyễn (2026a) là nền của mô hình M</w:t>
       </w:r>
       <w:r>
         <w:rPr>
@@ -12151,7 +12125,7 @@
         <w:t xml:space="preserve">5</w:t>
       </w:r>
       <w:r>
-        <w:t xml:space="preserve">, và bản thảo số 1 giúp thí sinh làm quen với việc so sánh nhiều mô hình danh mục trên cùng dữ liệu.</w:t>
+        <w:t xml:space="preserve">, và bài báo số 4 ở Bảng 6 giúp thí sinh làm quen với việc so sánh nhiều mô hình danh mục trên cùng dữ liệu.</w:t>
       </w:r>
     </w:p>
     <w:p>

</xml_diff>

<commit_message>
Vòng 14: viết lại 7 công thức theo kiểu kinh tế lượng cổ điển, chỉ số dưới không dấu phẩy
Co-Authored-By: Claude Opus 5.5 <noreply@anthropic.com>
Claude-Session: https://claude.ai/code/session_012s8WfVyLuhc473yaQuJygq
</commit_message>
<xml_diff>
--- a/outputs/round-14/de-cuong-v14-round-14.docx
+++ b/outputs/round-14/de-cuong-v14-round-14.docx
@@ -4937,7 +4937,7 @@
         <w:pStyle w:val="FirstParagraph"/>
       </w:pPr>
       <w:r>
-        <w:t xml:space="preserve">Các chỉ báo được gộp thành Chỉ số chất lượng thị trường vốn theo hướng dẫn của OECD (2008). Mỗi chỉ báo được chuẩn hóa thành điểm z theo mẫu gộp các sàn trong giai đoạn tham chiếu, để giá trị đã công bố không phải tính lại, rồi đổi dấu sao cho giá trị cao hơn là chất lượng tốt hơn. Với sàn k và tháng t, chỉ số là:</w:t>
+        <w:t xml:space="preserve">Các chỉ báo được gộp thành Chỉ số chất lượng thị trường vốn theo hướng dẫn của OECD (2008). Mỗi chỉ báo được chuẩn hóa thành điểm z theo mẫu gộp các sàn trong giai đoạn tham chiếu, để giá trị đã công bố không phải tính lại, rồi đổi dấu sao cho giá trị cao hơn là chất lượng tốt hơn. Với sàn j và tháng t, chỉ số là:</w:t>
       </w:r>
     </w:p>
     <w:p>
@@ -4972,22 +4972,7 @@
               <w:rPr>
                 <w:rFonts w:ascii="Cambria Math" w:hAnsi="Cambria Math"/>
               </w:rPr>
-              <m:t xml:space="preserve">k</m:t>
-            </m:r>
-            <m:r>
-              <m:rPr>
-                <m:sty m:val="p"/>
-              </m:rPr>
-              <w:rPr>
-                <w:rFonts w:ascii="Cambria Math" w:hAnsi="Cambria Math"/>
-              </w:rPr>
-              <m:t xml:space="preserve">,</m:t>
-            </m:r>
-            <m:r>
-              <w:rPr>
-                <w:rFonts w:ascii="Cambria Math" w:hAnsi="Cambria Math"/>
-              </w:rPr>
-              <m:t xml:space="preserve">t</m:t>
+              <m:t xml:space="preserve">jt</m:t>
             </m:r>
           </m:sub>
         </m:sSub>
@@ -4998,53 +4983,17 @@
           <w:rPr>
             <w:rFonts w:ascii="Cambria Math" w:hAnsi="Cambria Math"/>
           </w:rPr>
-          <m:t xml:space="preserve">=</m:t>
+          <m:t xml:space="preserve"> = </m:t>
         </m:r>
-        <m:nary>
-          <m:naryPr>
-            <m:chr m:val="∑"/>
-            <m:limLoc m:val="undOvr"/>
+        <m:f>
+          <m:fPr>
             <m:ctrlPr>
               <w:rPr>
                 <w:rFonts w:ascii="Cambria Math" w:hAnsi="Cambria Math"/>
               </w:rPr>
             </m:ctrlPr>
-          </m:naryPr>
-          <m:sub>
-            <m:r>
-              <w:rPr>
-                <w:rFonts w:ascii="Cambria Math" w:hAnsi="Cambria Math"/>
-              </w:rPr>
-              <m:t xml:space="preserve">j</m:t>
-            </m:r>
-            <m:r>
-              <m:rPr>
-                <m:sty m:val="p"/>
-              </m:rPr>
-              <w:rPr>
-                <w:rFonts w:ascii="Cambria Math" w:hAnsi="Cambria Math"/>
-              </w:rPr>
-              <m:t xml:space="preserve">=</m:t>
-            </m:r>
-            <m:r>
-              <m:rPr>
-                <m:sty m:val="p"/>
-              </m:rPr>
-              <w:rPr>
-                <w:rFonts w:ascii="Cambria Math" w:hAnsi="Cambria Math"/>
-              </w:rPr>
-              <m:t xml:space="preserve">1</m:t>
-            </m:r>
-          </m:sub>
-          <m:sup>
-            <m:r>
-              <w:rPr>
-                <w:rFonts w:ascii="Cambria Math" w:hAnsi="Cambria Math"/>
-              </w:rPr>
-              <m:t xml:space="preserve">J</m:t>
-            </m:r>
-          </m:sup>
-          <m:e>
+          </m:fPr>
+          <m:num>
             <m:sSub>
               <m:sSubPr>
                 <m:ctrlPr>
@@ -5055,10 +5004,13 @@
               </m:sSubPr>
               <m:e>
                 <m:r>
+                  <m:rPr>
+                    <m:sty m:val="p"/>
+                  </m:rPr>
                   <w:rPr>
                     <w:rFonts w:ascii="Cambria Math" w:hAnsi="Cambria Math"/>
                   </w:rPr>
-                  <m:t xml:space="preserve">w</m:t>
+                  <m:t xml:space="preserve">TK</m:t>
                 </m:r>
               </m:e>
               <m:sub>
@@ -5066,10 +5018,19 @@
                   <w:rPr>
                     <w:rFonts w:ascii="Cambria Math" w:hAnsi="Cambria Math"/>
                   </w:rPr>
-                  <m:t xml:space="preserve">j</m:t>
+                  <m:t xml:space="preserve">jt</m:t>
                 </m:r>
               </m:sub>
             </m:sSub>
+            <m:r>
+              <m:rPr>
+                <m:sty m:val="p"/>
+              </m:rPr>
+              <w:rPr>
+                <w:rFonts w:ascii="Cambria Math" w:hAnsi="Cambria Math"/>
+              </w:rPr>
+              <m:t xml:space="preserve"> + </m:t>
+            </m:r>
             <m:sSub>
               <m:sSubPr>
                 <m:ctrlPr>
@@ -5080,10 +5041,13 @@
               </m:sSubPr>
               <m:e>
                 <m:r>
+                  <m:rPr>
+                    <m:sty m:val="p"/>
+                  </m:rPr>
                   <w:rPr>
                     <w:rFonts w:ascii="Cambria Math" w:hAnsi="Cambria Math"/>
                   </w:rPr>
-                  <m:t xml:space="preserve">z</m:t>
+                  <m:t xml:space="preserve">HQ</m:t>
                 </m:r>
               </m:e>
               <m:sub>
@@ -5091,8 +5055,28 @@
                   <w:rPr>
                     <w:rFonts w:ascii="Cambria Math" w:hAnsi="Cambria Math"/>
                   </w:rPr>
-                  <m:t xml:space="preserve">j</m:t>
+                  <m:t xml:space="preserve">jt</m:t>
                 </m:r>
+              </m:sub>
+            </m:sSub>
+            <m:r>
+              <m:rPr>
+                <m:sty m:val="p"/>
+              </m:rPr>
+              <w:rPr>
+                <w:rFonts w:ascii="Cambria Math" w:hAnsi="Cambria Math"/>
+              </w:rPr>
+              <m:t xml:space="preserve"> + </m:t>
+            </m:r>
+            <m:sSub>
+              <m:sSubPr>
+                <m:ctrlPr>
+                  <w:rPr>
+                    <w:rFonts w:ascii="Cambria Math" w:hAnsi="Cambria Math"/>
+                  </w:rPr>
+                </m:ctrlPr>
+              </m:sSubPr>
+              <m:e>
                 <m:r>
                   <m:rPr>
                     <m:sty m:val="p"/>
@@ -5100,33 +5084,31 @@
                   <w:rPr>
                     <w:rFonts w:ascii="Cambria Math" w:hAnsi="Cambria Math"/>
                   </w:rPr>
-                  <m:t xml:space="preserve">,</m:t>
+                  <m:t xml:space="preserve">MB</m:t>
                 </m:r>
+              </m:e>
+              <m:sub>
                 <m:r>
                   <w:rPr>
                     <w:rFonts w:ascii="Cambria Math" w:hAnsi="Cambria Math"/>
                   </w:rPr>
-                  <m:t xml:space="preserve">k</m:t>
-                </m:r>
-                <m:r>
-                  <m:rPr>
-                    <m:sty m:val="p"/>
-                  </m:rPr>
-                  <w:rPr>
-                    <w:rFonts w:ascii="Cambria Math" w:hAnsi="Cambria Math"/>
-                  </w:rPr>
-                  <m:t xml:space="preserve">,</m:t>
-                </m:r>
-                <m:r>
-                  <w:rPr>
-                    <w:rFonts w:ascii="Cambria Math" w:hAnsi="Cambria Math"/>
-                  </w:rPr>
-                  <m:t xml:space="preserve">t</m:t>
+                  <m:t xml:space="preserve">jt</m:t>
                 </m:r>
               </m:sub>
             </m:sSub>
-          </m:e>
-        </m:nary>
+          </m:num>
+          <m:den>
+            <m:r>
+              <m:rPr>
+                <m:sty m:val="p"/>
+              </m:rPr>
+              <w:rPr>
+                <w:rFonts w:ascii="Cambria Math" w:hAnsi="Cambria Math"/>
+              </w:rPr>
+              <m:t xml:space="preserve">3</m:t>
+            </m:r>
+          </m:den>
+        </m:f>
       </m:oMath>
       <w:r>
         <w:t xml:space="preserve"> </w:t>
@@ -5139,89 +5121,43 @@
         <w:pStyle w:val="FirstParagraph"/>
       </w:pPr>
       <w:r>
-        <w:t xml:space="preserve">trong đó MQI là Chỉ số chất lượng thị trường vốn, J = 6 là số chỉ báo, </w:t>
-      </w:r>
-      <w:r>
-        <w:rPr>
-          <w:i/>
-          <w:iCs/>
-        </w:rPr>
-        <w:t xml:space="preserve">z</w:t>
+        <w:t xml:space="preserve">trong đó MQI</w:t>
       </w:r>
       <w:r>
         <w:rPr>
           <w:vertAlign w:val="subscript"/>
         </w:rPr>
-        <w:t xml:space="preserve">j,k,t</w:t>
-      </w:r>
-      <w:r>
-        <w:t xml:space="preserve"> là điểm z của chỉ báo j, và </w:t>
-      </w:r>
-      <w:r>
-        <w:rPr>
-          <w:i/>
-          <w:iCs/>
-        </w:rPr>
-        <w:t xml:space="preserve">w</w:t>
+        <w:t xml:space="preserve">jt</w:t>
+      </w:r>
+      <w:r>
+        <w:t xml:space="preserve"> là Chỉ số chất lượng thị trường vốn của sàn j (sàn niêm yết HNX, UPCoM hoặc HOSE) trong tháng t; TK</w:t>
       </w:r>
       <w:r>
         <w:rPr>
           <w:vertAlign w:val="subscript"/>
         </w:rPr>
-        <w:t xml:space="preserve">j</w:t>
-      </w:r>
-      <w:r>
-        <w:t xml:space="preserve"> = 1/(3·</w:t>
-      </w:r>
-      <w:r>
-        <w:rPr>
-          <w:i/>
-          <w:iCs/>
-        </w:rPr>
-        <w:t xml:space="preserve">n</w:t>
+        <w:t xml:space="preserve">jt</w:t>
+      </w:r>
+      <w:r>
+        <w:t xml:space="preserve">, HQ</w:t>
       </w:r>
       <w:r>
         <w:rPr>
           <w:vertAlign w:val="subscript"/>
         </w:rPr>
-        <w:t xml:space="preserve">d(j)</w:t>
-      </w:r>
-      <w:r>
-        <w:t xml:space="preserve">) là trọng số, với </w:t>
-      </w:r>
-      <w:r>
-        <w:rPr>
-          <w:i/>
-          <w:iCs/>
-        </w:rPr>
-        <w:t xml:space="preserve">n</w:t>
+        <w:t xml:space="preserve">jt</w:t>
+      </w:r>
+      <w:r>
+        <w:t xml:space="preserve"> và MB</w:t>
       </w:r>
       <w:r>
         <w:rPr>
           <w:vertAlign w:val="subscript"/>
         </w:rPr>
-        <w:t xml:space="preserve">d(j)</w:t>
-      </w:r>
-      <w:r>
-        <w:t xml:space="preserve"> là số chỉ báo thuộc chiều chứa chỉ báo j; k chỉ sàn (sàn niêm yết HNX, UPCoM hoặc HOSE). Trọng số từ thành phần chính thứ nhất và cách gộp bỏ lần lượt từng chiều là kiểm tra độ vững (OECD, 2008).</w:t>
-      </w:r>
-      <w:r>
-        <w:rPr>
-          <w:vertAlign w:val="subscript"/>
-        </w:rPr>
-        <w:t xml:space="preserve"/>
-      </w:r>
-      <w:r>
-        <w:t xml:space="preserve"/>
-      </w:r>
-      <w:r>
-        <w:rPr>
-          <w:vertAlign w:val="subscript"/>
-        </w:rPr>
-        <w:t xml:space="preserve"/>
-      </w:r>
-      <w:r>
-        <w:t xml:space="preserve"/>
+        <w:t xml:space="preserve">jt</w:t>
+      </w:r>
+      <w:r>
+        <w:t xml:space="preserve"> là điểm của ba chiều thanh khoản, hiệu quả thông tin và minh bạch, mỗi điểm bằng trung bình các điểm z của chỉ báo thuộc chiều đó (ba chỉ báo thanh khoản, hai chỉ báo hiệu quả thông tin, một chỉ báo minh bạch). Như vậy ba chiều có trọng số bằng nhau. Trọng số từ thành phần chính thứ nhất và cách gộp bỏ lần lượt từng chiều là kiểm tra độ vững (OECD, 2008).</w:t>
       </w:r>
     </w:p>
     <w:p>
@@ -5783,25 +5719,7 @@
         <w:pStyle w:val="FirstParagraph"/>
       </w:pPr>
       <w:r>
-        <w:t xml:space="preserve">Gọi M = {M</w:t>
-      </w:r>
-      <w:r>
-        <w:rPr>
-          <w:vertAlign w:val="subscript"/>
-        </w:rPr>
-        <w:t xml:space="preserve">1</w:t>
-      </w:r>
-      <w:r>
-        <w:t xml:space="preserve">, …, M</w:t>
-      </w:r>
-      <w:r>
-        <w:rPr>
-          <w:vertAlign w:val="subscript"/>
-        </w:rPr>
-        <w:t xml:space="preserve">7</w:t>
-      </w:r>
-      <w:r>
-        <w:t xml:space="preserve">} là tập mô hình ở Bảng 3 và b ∈ {H, CS} là rổ, trong đó CS là rổ cổ phiếu chuyển sàn và H là rổ cổ phiếu HOSE được ghép với CS. Với cửa sổ đánh giá kết thúc tại t, </w:t>
+        <w:t xml:space="preserve">Với mỗi mô hình, mỗi rổ (rổ CS gồm cổ phiếu chuyển sàn, rổ H gồm cổ phiếu HOSE được ghép với rổ CS) và mỗi cửa sổ đánh giá, </w:t>
       </w:r>
       <w:r>
         <w:rPr>
@@ -5811,12 +5729,6 @@
         <w:t xml:space="preserve">μ</w:t>
       </w:r>
       <w:r>
-        <w:rPr>
-          <w:vertAlign w:val="subscript"/>
-        </w:rPr>
-        <w:t xml:space="preserve">m,b,t</w:t>
-      </w:r>
-      <w:r>
         <w:t xml:space="preserve"> và </w:t>
       </w:r>
       <w:r>
@@ -5827,16 +5739,7 @@
         <w:t xml:space="preserve">σ</w:t>
       </w:r>
       <w:r>
-        <w:t xml:space="preserve">²</w:t>
-      </w:r>
-      <w:r>
-        <w:rPr>
-          <w:vertAlign w:val="subscript"/>
-        </w:rPr>
-        <w:t xml:space="preserve">m,b,t</w:t>
-      </w:r>
-      <w:r>
-        <w:t xml:space="preserve"> là trung bình và phương sai mẫu của lợi suất vượt trội tuần sau chi phí, nhân với 52 để quy năm; </w:t>
+        <w:t xml:space="preserve">² là trung bình và phương sai mẫu của lợi suất vượt trội tuần sau chi phí, nhân với 52 để quy năm; </w:t>
       </w:r>
       <w:r>
         <w:rPr>
@@ -5865,61 +5768,12 @@
         <w:tab/>
       </w:r>
       <m:oMath>
-        <m:sSub>
-          <m:sSubPr>
-            <m:ctrlPr>
-              <w:rPr>
-                <w:rFonts w:ascii="Cambria Math" w:hAnsi="Cambria Math"/>
-              </w:rPr>
-            </m:ctrlPr>
-          </m:sSubPr>
-          <m:e>
-            <m:r>
-              <w:rPr>
-                <w:rFonts w:ascii="Cambria Math" w:hAnsi="Cambria Math"/>
-              </w:rPr>
-              <m:t xml:space="preserve">U</m:t>
-            </m:r>
-          </m:e>
-          <m:sub>
-            <m:r>
-              <w:rPr>
-                <w:rFonts w:ascii="Cambria Math" w:hAnsi="Cambria Math"/>
-              </w:rPr>
-              <m:t xml:space="preserve">m</m:t>
-            </m:r>
-            <m:r>
-              <m:rPr>
-                <m:sty m:val="p"/>
-              </m:rPr>
-              <w:rPr>
-                <w:rFonts w:ascii="Cambria Math" w:hAnsi="Cambria Math"/>
-              </w:rPr>
-              <m:t xml:space="preserve">,</m:t>
-            </m:r>
-            <m:r>
-              <w:rPr>
-                <w:rFonts w:ascii="Cambria Math" w:hAnsi="Cambria Math"/>
-              </w:rPr>
-              <m:t xml:space="preserve">b</m:t>
-            </m:r>
-            <m:r>
-              <m:rPr>
-                <m:sty m:val="p"/>
-              </m:rPr>
-              <w:rPr>
-                <w:rFonts w:ascii="Cambria Math" w:hAnsi="Cambria Math"/>
-              </w:rPr>
-              <m:t xml:space="preserve">,</m:t>
-            </m:r>
-            <m:r>
-              <w:rPr>
-                <w:rFonts w:ascii="Cambria Math" w:hAnsi="Cambria Math"/>
-              </w:rPr>
-              <m:t xml:space="preserve">t</m:t>
-            </m:r>
-          </m:sub>
-        </m:sSub>
+        <m:r>
+          <w:rPr>
+            <w:rFonts w:ascii="Cambria Math" w:hAnsi="Cambria Math"/>
+          </w:rPr>
+          <m:t xml:space="preserve">U</m:t>
+        </m:r>
         <m:r>
           <m:rPr>
             <m:sty m:val="p"/>
@@ -5927,63 +5781,14 @@
           <w:rPr>
             <w:rFonts w:ascii="Cambria Math" w:hAnsi="Cambria Math"/>
           </w:rPr>
-          <m:t xml:space="preserve">=</m:t>
+          <m:t xml:space="preserve"> = </m:t>
         </m:r>
-        <m:sSub>
-          <m:sSubPr>
-            <m:ctrlPr>
-              <w:rPr>
-                <w:rFonts w:ascii="Cambria Math" w:hAnsi="Cambria Math"/>
-              </w:rPr>
-            </m:ctrlPr>
-          </m:sSubPr>
-          <m:e>
-            <m:r>
-              <w:rPr>
-                <w:rFonts w:ascii="Cambria Math" w:hAnsi="Cambria Math"/>
-              </w:rPr>
-              <m:t xml:space="preserve">μ</m:t>
-            </m:r>
-          </m:e>
-          <m:sub>
-            <m:r>
-              <w:rPr>
-                <w:rFonts w:ascii="Cambria Math" w:hAnsi="Cambria Math"/>
-              </w:rPr>
-              <m:t xml:space="preserve">m</m:t>
-            </m:r>
-            <m:r>
-              <m:rPr>
-                <m:sty m:val="p"/>
-              </m:rPr>
-              <w:rPr>
-                <w:rFonts w:ascii="Cambria Math" w:hAnsi="Cambria Math"/>
-              </w:rPr>
-              <m:t xml:space="preserve">,</m:t>
-            </m:r>
-            <m:r>
-              <w:rPr>
-                <w:rFonts w:ascii="Cambria Math" w:hAnsi="Cambria Math"/>
-              </w:rPr>
-              <m:t xml:space="preserve">b</m:t>
-            </m:r>
-            <m:r>
-              <m:rPr>
-                <m:sty m:val="p"/>
-              </m:rPr>
-              <w:rPr>
-                <w:rFonts w:ascii="Cambria Math" w:hAnsi="Cambria Math"/>
-              </w:rPr>
-              <m:t xml:space="preserve">,</m:t>
-            </m:r>
-            <m:r>
-              <w:rPr>
-                <w:rFonts w:ascii="Cambria Math" w:hAnsi="Cambria Math"/>
-              </w:rPr>
-              <m:t xml:space="preserve">t</m:t>
-            </m:r>
-          </m:sub>
-        </m:sSub>
+        <m:r>
+          <w:rPr>
+            <w:rFonts w:ascii="Cambria Math" w:hAnsi="Cambria Math"/>
+          </w:rPr>
+          <m:t xml:space="preserve">μ</m:t>
+        </m:r>
         <m:r>
           <m:rPr>
             <m:sty m:val="p"/>
@@ -5991,7 +5796,7 @@
           <w:rPr>
             <w:rFonts w:ascii="Cambria Math" w:hAnsi="Cambria Math"/>
           </w:rPr>
-          <m:t xml:space="preserve">−</m:t>
+          <m:t xml:space="preserve"> − </m:t>
         </m:r>
         <m:f>
           <m:fPr>
@@ -6021,14 +5826,14 @@
             </m:r>
           </m:den>
         </m:f>
-        <m:sSubSup>
-          <m:sSubSupPr>
+        <m:sSup>
+          <m:sSupPr>
             <m:ctrlPr>
               <w:rPr>
                 <w:rFonts w:ascii="Cambria Math" w:hAnsi="Cambria Math"/>
               </w:rPr>
             </m:ctrlPr>
-          </m:sSubSupPr>
+          </m:sSupPr>
           <m:e>
             <m:r>
               <w:rPr>
@@ -6037,44 +5842,6 @@
               <m:t xml:space="preserve">σ</m:t>
             </m:r>
           </m:e>
-          <m:sub>
-            <m:r>
-              <w:rPr>
-                <w:rFonts w:ascii="Cambria Math" w:hAnsi="Cambria Math"/>
-              </w:rPr>
-              <m:t xml:space="preserve">m</m:t>
-            </m:r>
-            <m:r>
-              <m:rPr>
-                <m:sty m:val="p"/>
-              </m:rPr>
-              <w:rPr>
-                <w:rFonts w:ascii="Cambria Math" w:hAnsi="Cambria Math"/>
-              </w:rPr>
-              <m:t xml:space="preserve">,</m:t>
-            </m:r>
-            <m:r>
-              <w:rPr>
-                <w:rFonts w:ascii="Cambria Math" w:hAnsi="Cambria Math"/>
-              </w:rPr>
-              <m:t xml:space="preserve">b</m:t>
-            </m:r>
-            <m:r>
-              <m:rPr>
-                <m:sty m:val="p"/>
-              </m:rPr>
-              <w:rPr>
-                <w:rFonts w:ascii="Cambria Math" w:hAnsi="Cambria Math"/>
-              </w:rPr>
-              <m:t xml:space="preserve">,</m:t>
-            </m:r>
-            <m:r>
-              <w:rPr>
-                <w:rFonts w:ascii="Cambria Math" w:hAnsi="Cambria Math"/>
-              </w:rPr>
-              <m:t xml:space="preserve">t</m:t>
-            </m:r>
-          </m:sub>
           <m:sup>
             <m:r>
               <m:rPr>
@@ -6086,7 +5853,7 @@
               <m:t xml:space="preserve">2</m:t>
             </m:r>
           </m:sup>
-        </m:sSubSup>
+        </m:sSup>
       </m:oMath>
       <w:r>
         <w:t xml:space="preserve"> </w:t>
@@ -6133,21 +5900,6 @@
               </w:rPr>
               <m:t xml:space="preserve">m</m:t>
             </m:r>
-            <m:r>
-              <m:rPr>
-                <m:sty m:val="p"/>
-              </m:rPr>
-              <w:rPr>
-                <w:rFonts w:ascii="Cambria Math" w:hAnsi="Cambria Math"/>
-              </w:rPr>
-              <m:t xml:space="preserve">,</m:t>
-            </m:r>
-            <m:r>
-              <w:rPr>
-                <w:rFonts w:ascii="Cambria Math" w:hAnsi="Cambria Math"/>
-              </w:rPr>
-              <m:t xml:space="preserve">t</m:t>
-            </m:r>
           </m:sub>
         </m:sSub>
         <m:r>
@@ -6157,7 +5909,7 @@
           <w:rPr>
             <w:rFonts w:ascii="Cambria Math" w:hAnsi="Cambria Math"/>
           </w:rPr>
-          <m:t xml:space="preserve">=</m:t>
+          <m:t xml:space="preserve"> = </m:t>
         </m:r>
         <m:sSub>
           <m:sSubPr>
@@ -6182,39 +5934,6 @@
               </w:rPr>
               <m:t xml:space="preserve">m</m:t>
             </m:r>
-            <m:r>
-              <m:rPr>
-                <m:sty m:val="p"/>
-              </m:rPr>
-              <w:rPr>
-                <w:rFonts w:ascii="Cambria Math" w:hAnsi="Cambria Math"/>
-              </w:rPr>
-              <m:t xml:space="preserve">,</m:t>
-            </m:r>
-            <m:r>
-              <m:rPr>
-                <m:sty m:val="p"/>
-              </m:rPr>
-              <w:rPr>
-                <w:rFonts w:ascii="Cambria Math" w:hAnsi="Cambria Math"/>
-              </w:rPr>
-              <m:t xml:space="preserve">H</m:t>
-            </m:r>
-            <m:r>
-              <m:rPr>
-                <m:sty m:val="p"/>
-              </m:rPr>
-              <w:rPr>
-                <w:rFonts w:ascii="Cambria Math" w:hAnsi="Cambria Math"/>
-              </w:rPr>
-              <m:t xml:space="preserve">,</m:t>
-            </m:r>
-            <m:r>
-              <w:rPr>
-                <w:rFonts w:ascii="Cambria Math" w:hAnsi="Cambria Math"/>
-              </w:rPr>
-              <m:t xml:space="preserve">t</m:t>
-            </m:r>
           </m:sub>
         </m:sSub>
         <m:r>
@@ -6224,7 +5943,7 @@
           <w:rPr>
             <w:rFonts w:ascii="Cambria Math" w:hAnsi="Cambria Math"/>
           </w:rPr>
-          <m:t xml:space="preserve">−</m:t>
+          <m:t xml:space="preserve">(H) − </m:t>
         </m:r>
         <m:sSub>
           <m:sSubPr>
@@ -6249,99 +5968,6 @@
               </w:rPr>
               <m:t xml:space="preserve">m</m:t>
             </m:r>
-            <m:r>
-              <m:rPr>
-                <m:sty m:val="p"/>
-              </m:rPr>
-              <w:rPr>
-                <w:rFonts w:ascii="Cambria Math" w:hAnsi="Cambria Math"/>
-              </w:rPr>
-              <m:t xml:space="preserve">,</m:t>
-            </m:r>
-            <m:r>
-              <m:rPr>
-                <m:sty m:val="p"/>
-              </m:rPr>
-              <w:rPr>
-                <w:rFonts w:ascii="Cambria Math" w:hAnsi="Cambria Math"/>
-              </w:rPr>
-              <m:t xml:space="preserve">CS</m:t>
-            </m:r>
-            <m:r>
-              <m:rPr>
-                <m:sty m:val="p"/>
-              </m:rPr>
-              <w:rPr>
-                <w:rFonts w:ascii="Cambria Math" w:hAnsi="Cambria Math"/>
-              </w:rPr>
-              <m:t xml:space="preserve">,</m:t>
-            </m:r>
-            <m:r>
-              <w:rPr>
-                <w:rFonts w:ascii="Cambria Math" w:hAnsi="Cambria Math"/>
-              </w:rPr>
-              <m:t xml:space="preserve">t</m:t>
-            </m:r>
-          </m:sub>
-        </m:sSub>
-      </m:oMath>
-      <w:r>
-        <w:t xml:space="preserve"> </w:t>
-        <w:tab/>
-        <w:t>(3)</w:t>
-      </w:r>
-    </w:p>
-    <w:p>
-      <w:pPr>
-        <w:pStyle w:val="FirstParagraph"/>
-      </w:pPr>
-      <w:r>
-        <w:t xml:space="preserve">Chỉ số khả năng đầu tư là khoảng cách bình quân theo bảy mô hình:</w:t>
-      </w:r>
-    </w:p>
-    <w:p>
-      <w:pPr>
-        <w:pStyle w:val="Equation"/>
-      </w:pPr>
-      <w:r>
-        <w:tab/>
-      </w:r>
-      <m:oMath>
-        <m:sSub>
-          <m:sSubPr>
-            <m:ctrlPr>
-              <w:rPr>
-                <w:rFonts w:ascii="Cambria Math" w:hAnsi="Cambria Math"/>
-              </w:rPr>
-            </m:ctrlPr>
-          </m:sSubPr>
-          <m:e>
-            <m:bar>
-              <m:barPr>
-                <m:pos m:val="top"/>
-                <m:ctrlPr>
-                  <w:rPr>
-                    <w:rFonts w:ascii="Cambria Math" w:hAnsi="Cambria Math"/>
-                  </w:rPr>
-                </m:ctrlPr>
-              </m:barPr>
-              <m:e>
-                <m:r>
-                  <w:rPr>
-                    <w:rFonts w:ascii="Cambria Math" w:hAnsi="Cambria Math"/>
-                  </w:rPr>
-                  <m:t xml:space="preserve">G</m:t>
-                </m:r>
-              </m:e>
-            </m:bar>
-          </m:e>
-          <m:sub>
-            <m:r>
-              <w:rPr>
-                <w:rFonts w:ascii="Cambria Math" w:hAnsi="Cambria Math"/>
-              </w:rPr>
-              <m:t xml:space="preserve">t</m:t>
-            </m:r>
           </m:sub>
         </m:sSub>
         <m:r>
@@ -6351,7 +5977,45 @@
           <w:rPr>
             <w:rFonts w:ascii="Cambria Math" w:hAnsi="Cambria Math"/>
           </w:rPr>
-          <m:t xml:space="preserve">=</m:t>
+          <m:t xml:space="preserve">(CS)</m:t>
+        </m:r>
+      </m:oMath>
+      <w:r>
+        <w:t xml:space="preserve"> </w:t>
+        <w:tab/>
+        <w:t>(3)</w:t>
+      </w:r>
+    </w:p>
+    <w:p>
+      <w:pPr>
+        <w:pStyle w:val="FirstParagraph"/>
+      </w:pPr>
+      <w:r>
+        <w:t xml:space="preserve">Chỉ số khả năng đầu tư là khoảng cách bình quân theo bảy mô hình:</w:t>
+      </w:r>
+    </w:p>
+    <w:p>
+      <w:pPr>
+        <w:pStyle w:val="Equation"/>
+      </w:pPr>
+      <w:r>
+        <w:tab/>
+      </w:r>
+      <m:oMath>
+        <m:r>
+          <w:rPr>
+            <w:rFonts w:ascii="Cambria Math" w:hAnsi="Cambria Math"/>
+          </w:rPr>
+          <m:t xml:space="preserve">Ḡ</m:t>
+        </m:r>
+        <m:r>
+          <m:rPr>
+            <m:sty m:val="p"/>
+          </m:rPr>
+          <w:rPr>
+            <w:rFonts w:ascii="Cambria Math" w:hAnsi="Cambria Math"/>
+          </w:rPr>
+          <m:t xml:space="preserve"> = </m:t>
         </m:r>
         <m:f>
           <m:fPr>
@@ -6362,74 +6026,6 @@
             </m:ctrlPr>
           </m:fPr>
           <m:num>
-            <m:r>
-              <m:rPr>
-                <m:sty m:val="p"/>
-              </m:rPr>
-              <w:rPr>
-                <w:rFonts w:ascii="Cambria Math" w:hAnsi="Cambria Math"/>
-              </w:rPr>
-              <m:t xml:space="preserve">1</m:t>
-            </m:r>
-          </m:num>
-          <m:den>
-            <m:d>
-              <m:dPr>
-                <m:begChr m:val="|"/>
-                <m:endChr m:val="|"/>
-                <m:ctrlPr>
-                  <w:rPr>
-                    <w:rFonts w:ascii="Cambria Math" w:hAnsi="Cambria Math"/>
-                  </w:rPr>
-                </m:ctrlPr>
-              </m:dPr>
-              <m:e>
-                <m:r>
-                  <w:rPr>
-                    <w:rFonts w:ascii="Cambria Math" w:hAnsi="Cambria Math"/>
-                  </w:rPr>
-                  <m:t xml:space="preserve">M</m:t>
-                </m:r>
-              </m:e>
-            </m:d>
-          </m:den>
-        </m:f>
-        <m:nary>
-          <m:naryPr>
-            <m:chr m:val="∑"/>
-            <m:limLoc m:val="undOvr"/>
-            <m:supHide m:val="1"/>
-            <m:ctrlPr>
-              <w:rPr>
-                <w:rFonts w:ascii="Cambria Math" w:hAnsi="Cambria Math"/>
-              </w:rPr>
-            </m:ctrlPr>
-          </m:naryPr>
-          <m:sub>
-            <m:r>
-              <w:rPr>
-                <w:rFonts w:ascii="Cambria Math" w:hAnsi="Cambria Math"/>
-              </w:rPr>
-              <m:t xml:space="preserve">m</m:t>
-            </m:r>
-            <m:r>
-              <m:rPr>
-                <m:sty m:val="p"/>
-              </m:rPr>
-              <w:rPr>
-                <w:rFonts w:ascii="Cambria Math" w:hAnsi="Cambria Math"/>
-              </w:rPr>
-              <m:t xml:space="preserve">∈</m:t>
-            </m:r>
-            <m:r>
-              <w:rPr>
-                <w:rFonts w:ascii="Cambria Math" w:hAnsi="Cambria Math"/>
-              </w:rPr>
-              <m:t xml:space="preserve">M</m:t>
-            </m:r>
-          </m:sub>
-          <m:sup/>
-          <m:e>
             <m:sSub>
               <m:sSubPr>
                 <m:ctrlPr>
@@ -6451,27 +6047,91 @@
                   <w:rPr>
                     <w:rFonts w:ascii="Cambria Math" w:hAnsi="Cambria Math"/>
                   </w:rPr>
-                  <m:t xml:space="preserve">m</m:t>
+                  <m:t xml:space="preserve">1</m:t>
                 </m:r>
-                <m:r>
-                  <m:rPr>
-                    <m:sty m:val="p"/>
-                  </m:rPr>
+              </m:sub>
+            </m:sSub>
+            <m:r>
+              <m:rPr>
+                <m:sty m:val="p"/>
+              </m:rPr>
+              <w:rPr>
+                <w:rFonts w:ascii="Cambria Math" w:hAnsi="Cambria Math"/>
+              </w:rPr>
+              <m:t xml:space="preserve"> + </m:t>
+            </m:r>
+            <m:sSub>
+              <m:sSubPr>
+                <m:ctrlPr>
                   <w:rPr>
                     <w:rFonts w:ascii="Cambria Math" w:hAnsi="Cambria Math"/>
                   </w:rPr>
-                  <m:t xml:space="preserve">,</m:t>
-                </m:r>
+                </m:ctrlPr>
+              </m:sSubPr>
+              <m:e>
                 <m:r>
                   <w:rPr>
                     <w:rFonts w:ascii="Cambria Math" w:hAnsi="Cambria Math"/>
                   </w:rPr>
-                  <m:t xml:space="preserve">t</m:t>
+                  <m:t xml:space="preserve">G</m:t>
+                </m:r>
+              </m:e>
+              <m:sub>
+                <m:r>
+                  <w:rPr>
+                    <w:rFonts w:ascii="Cambria Math" w:hAnsi="Cambria Math"/>
+                  </w:rPr>
+                  <m:t xml:space="preserve">2</m:t>
                 </m:r>
               </m:sub>
             </m:sSub>
-          </m:e>
-        </m:nary>
+            <m:r>
+              <m:rPr>
+                <m:sty m:val="p"/>
+              </m:rPr>
+              <w:rPr>
+                <w:rFonts w:ascii="Cambria Math" w:hAnsi="Cambria Math"/>
+              </w:rPr>
+              <m:t xml:space="preserve"> + … + </m:t>
+            </m:r>
+            <m:sSub>
+              <m:sSubPr>
+                <m:ctrlPr>
+                  <w:rPr>
+                    <w:rFonts w:ascii="Cambria Math" w:hAnsi="Cambria Math"/>
+                  </w:rPr>
+                </m:ctrlPr>
+              </m:sSubPr>
+              <m:e>
+                <m:r>
+                  <w:rPr>
+                    <w:rFonts w:ascii="Cambria Math" w:hAnsi="Cambria Math"/>
+                  </w:rPr>
+                  <m:t xml:space="preserve">G</m:t>
+                </m:r>
+              </m:e>
+              <m:sub>
+                <m:r>
+                  <w:rPr>
+                    <w:rFonts w:ascii="Cambria Math" w:hAnsi="Cambria Math"/>
+                  </w:rPr>
+                  <m:t xml:space="preserve">7</m:t>
+                </m:r>
+              </m:sub>
+            </m:sSub>
+          </m:num>
+          <m:den>
+            <m:r>
+              <m:rPr>
+                <m:sty m:val="p"/>
+              </m:rPr>
+              <w:rPr>
+                <w:rFonts w:ascii="Cambria Math" w:hAnsi="Cambria Math"/>
+              </w:rPr>
+              <m:t xml:space="preserve">7</m:t>
+            </m:r>
+          </m:den>
+        </m:f>
       </m:oMath>
       <w:r>
         <w:t xml:space="preserve"> </w:t>
@@ -6484,23 +6144,33 @@
         <w:pStyle w:val="FirstParagraph"/>
       </w:pPr>
       <w:r>
-        <w:t xml:space="preserve">Chỉ số khả năng đầu tư tính bằng điểm phần trăm mỗi năm; giá trị dương nghĩa là nhà đầu tư đa dạng hóa đạt lợi suất tương đương chắc chắn thấp hơn với rổ CS so với rổ H. Đề tài báo cáo kèm độ phân tán của </w:t>
+        <w:t xml:space="preserve">Chỉ số khả năng đầu tư </w:t>
       </w:r>
       <w:r>
         <w:rPr>
           <w:i/>
           <w:iCs/>
         </w:rPr>
+        <w:t xml:space="preserve">Ḡ</w:t>
+      </w:r>
+      <w:r>
+        <w:t xml:space="preserve"> được tính cho từng cửa sổ đánh giá, bằng điểm phần trăm mỗi năm; giá trị dương nghĩa là nhà đầu tư đa dạng hóa đạt lợi suất tương đương chắc chắn thấp hơn với rổ CS so với rổ H. Đề tài báo cáo kèm độ phân tán của </w:t>
+      </w:r>
+      <w:r>
+        <w:rPr>
+          <w:i/>
+          <w:iCs/>
+        </w:rPr>
         <w:t xml:space="preserve">G</w:t>
       </w:r>
       <w:r>
         <w:rPr>
           <w:vertAlign w:val="subscript"/>
         </w:rPr>
-        <w:t xml:space="preserve">m,t</w:t>
-      </w:r>
-      <w:r>
-        <w:t xml:space="preserve"> theo m.</w:t>
+        <w:t xml:space="preserve">m</w:t>
+      </w:r>
+      <w:r>
+        <w:t xml:space="preserve"> giữa bảy mô hình.</w:t>
       </w:r>
     </w:p>
     <w:p>
@@ -7411,13 +7081,20 @@
         <w:pStyle w:val="SourceNote"/>
       </w:pPr>
       <w:r>
-        <w:t xml:space="preserve">Nguồn: Thí sinh đề xuất. Ghi chú: ở mỗi cửa sổ đánh giá, đề tài tính lợi suất tương đương chắc chắn của bảy mô hình trên rổ CS và rổ H, rồi tính khoảng cách G</w:t>
+        <w:t xml:space="preserve">Nguồn: Thí sinh đề xuất. Ghi chú: ở mỗi cửa sổ đánh giá, đề tài tính lợi suất tương đương chắc chắn của bảy mô hình trên rổ CS và rổ H, rồi tính khoảng cách </w:t>
+      </w:r>
+      <w:r>
+        <w:rPr>
+          <w:i/>
+          <w:iCs/>
+        </w:rPr>
+        <w:t xml:space="preserve">G</w:t>
       </w:r>
       <w:r>
         <w:rPr>
           <w:vertAlign w:val="subscript"/>
         </w:rPr>
-        <w:t xml:space="preserve">m,t</w:t>
+        <w:t xml:space="preserve">m</w:t>
       </w:r>
       <w:r>
         <w:t xml:space="preserve">.</w:t>
@@ -7481,22 +7158,7 @@
               <w:rPr>
                 <w:rFonts w:ascii="Cambria Math" w:hAnsi="Cambria Math"/>
               </w:rPr>
-              <m:t xml:space="preserve">i</m:t>
-            </m:r>
-            <m:r>
-              <m:rPr>
-                <m:sty m:val="p"/>
-              </m:rPr>
-              <w:rPr>
-                <w:rFonts w:ascii="Cambria Math" w:hAnsi="Cambria Math"/>
-              </w:rPr>
-              <m:t xml:space="preserve">,</m:t>
-            </m:r>
-            <m:r>
-              <w:rPr>
-                <w:rFonts w:ascii="Cambria Math" w:hAnsi="Cambria Math"/>
-              </w:rPr>
-              <m:t xml:space="preserve">t</m:t>
+              <m:t xml:space="preserve">it</m:t>
             </m:r>
           </m:sub>
         </m:sSub>
@@ -7507,7 +7169,7 @@
           <w:rPr>
             <w:rFonts w:ascii="Cambria Math" w:hAnsi="Cambria Math"/>
           </w:rPr>
-          <m:t xml:space="preserve">=</m:t>
+          <m:t xml:space="preserve"> = </m:t>
         </m:r>
         <m:sSub>
           <m:sSubPr>
@@ -7541,7 +7203,7 @@
           <w:rPr>
             <w:rFonts w:ascii="Cambria Math" w:hAnsi="Cambria Math"/>
           </w:rPr>
-          <m:t xml:space="preserve">+</m:t>
+          <m:t xml:space="preserve"> + </m:t>
         </m:r>
         <m:sSub>
           <m:sSubPr>
@@ -7575,7 +7237,7 @@
           <w:rPr>
             <w:rFonts w:ascii="Cambria Math" w:hAnsi="Cambria Math"/>
           </w:rPr>
-          <m:t xml:space="preserve">+</m:t>
+          <m:t xml:space="preserve"> + </m:t>
         </m:r>
         <m:r>
           <w:rPr>
@@ -7590,7 +7252,7 @@
           <w:rPr>
             <w:rFonts w:ascii="Cambria Math" w:hAnsi="Cambria Math"/>
           </w:rPr>
-          <m:t xml:space="preserve">⋅</m:t>
+          <m:t xml:space="preserve">(</m:t>
         </m:r>
         <m:sSub>
           <m:sSubPr>
@@ -7624,7 +7286,7 @@
           <w:rPr>
             <w:rFonts w:ascii="Cambria Math" w:hAnsi="Cambria Math"/>
           </w:rPr>
-          <m:t xml:space="preserve">⋅</m:t>
+          <m:t xml:space="preserve"> × </m:t>
         </m:r>
         <m:sSub>
           <m:sSubPr>
@@ -7636,9 +7298,6 @@
           </m:sSubPr>
           <m:e>
             <m:r>
-              <m:rPr>
-                <m:sty m:val="p"/>
-              </m:rPr>
               <w:rPr>
                 <w:rFonts w:ascii="Cambria Math" w:hAnsi="Cambria Math"/>
               </w:rPr>
@@ -7661,7 +7320,7 @@
           <w:rPr>
             <w:rFonts w:ascii="Cambria Math" w:hAnsi="Cambria Math"/>
           </w:rPr>
-          <m:t xml:space="preserve">+</m:t>
+          <m:t xml:space="preserve">) + </m:t>
         </m:r>
         <m:sSub>
           <m:sSubPr>
@@ -7684,22 +7343,7 @@
               <w:rPr>
                 <w:rFonts w:ascii="Cambria Math" w:hAnsi="Cambria Math"/>
               </w:rPr>
-              <m:t xml:space="preserve">i</m:t>
-            </m:r>
-            <m:r>
-              <m:rPr>
-                <m:sty m:val="p"/>
-              </m:rPr>
-              <w:rPr>
-                <w:rFonts w:ascii="Cambria Math" w:hAnsi="Cambria Math"/>
-              </w:rPr>
-              <m:t xml:space="preserve">,</m:t>
-            </m:r>
-            <m:r>
-              <w:rPr>
-                <w:rFonts w:ascii="Cambria Math" w:hAnsi="Cambria Math"/>
-              </w:rPr>
-              <m:t xml:space="preserve">t</m:t>
+              <m:t xml:space="preserve">it</m:t>
             </m:r>
           </m:sub>
         </m:sSub>
@@ -7728,19 +7372,10 @@
         <w:rPr>
           <w:vertAlign w:val="subscript"/>
         </w:rPr>
-        <w:t xml:space="preserve">i</w:t>
-      </w:r>
-      <w:r>
-        <w:t xml:space="preserve">,</w:t>
-      </w:r>
-      <w:r>
-        <w:rPr>
-          <w:vertAlign w:val="subscript"/>
-        </w:rPr>
-        <w:t xml:space="preserve">t</w:t>
-      </w:r>
-      <w:r>
-        <w:t xml:space="preserve"> là logarit của độ phi thanh khoản Amihud tính trên các ngày có lợi suất tuyệt đối dưới ngưỡng chung và không liền sau một ngày có lợi suất tuyệt đối từ ngưỡng này trở lên (mục 4.3.2); </w:t>
+        <w:t xml:space="preserve">it</w:t>
+      </w:r>
+      <w:r>
+        <w:t xml:space="preserve"> là logarit của độ phi thanh khoản Amihud của cổ phiếu i trong tháng t, tính trên các ngày có lợi suất tuyệt đối dưới ngưỡng chung và không liền sau một ngày có lợi suất tuyệt đối từ ngưỡng này trở lên (mục 4.3.2); </w:t>
       </w:r>
       <w:r>
         <w:rPr>
@@ -7804,7 +7439,17 @@
         <w:t xml:space="preserve">t</w:t>
       </w:r>
       <w:r>
-        <w:t xml:space="preserve"> là hiệu ứng cố định theo cổ phiếu và theo tháng.</w:t>
+        <w:t xml:space="preserve"> là hiệu ứng cố định theo cổ phiếu và theo tháng; </w:t>
+      </w:r>
+      <w:r>
+        <w:rPr>
+          <w:i/>
+          <w:iCs/>
+        </w:rPr>
+        <w:t xml:space="preserve">δ</w:t>
+      </w:r>
+      <w:r>
+        <w:t xml:space="preserve"> là tác động của việc chuyển sàn.</w:t>
       </w:r>
     </w:p>
     <w:p>
@@ -7921,22 +7566,7 @@
               <w:rPr>
                 <w:rFonts w:ascii="Cambria Math" w:hAnsi="Cambria Math"/>
               </w:rPr>
-              <m:t xml:space="preserve">i</m:t>
-            </m:r>
-            <m:r>
-              <m:rPr>
-                <m:sty m:val="p"/>
-              </m:rPr>
-              <w:rPr>
-                <w:rFonts w:ascii="Cambria Math" w:hAnsi="Cambria Math"/>
-              </w:rPr>
-              <m:t xml:space="preserve">,</m:t>
-            </m:r>
-            <m:r>
-              <w:rPr>
-                <w:rFonts w:ascii="Cambria Math" w:hAnsi="Cambria Math"/>
-              </w:rPr>
-              <m:t xml:space="preserve">t</m:t>
+              <m:t xml:space="preserve">it</m:t>
             </m:r>
           </m:sub>
         </m:sSub>
@@ -7947,7 +7577,7 @@
           <w:rPr>
             <w:rFonts w:ascii="Cambria Math" w:hAnsi="Cambria Math"/>
           </w:rPr>
-          <m:t xml:space="preserve">=</m:t>
+          <m:t xml:space="preserve"> = </m:t>
         </m:r>
         <m:sSub>
           <m:sSubPr>
@@ -7981,7 +7611,7 @@
           <w:rPr>
             <w:rFonts w:ascii="Cambria Math" w:hAnsi="Cambria Math"/>
           </w:rPr>
-          <m:t xml:space="preserve">+</m:t>
+          <m:t xml:space="preserve"> + </m:t>
         </m:r>
         <m:sSub>
           <m:sSubPr>
@@ -8015,7 +7645,7 @@
           <w:rPr>
             <w:rFonts w:ascii="Cambria Math" w:hAnsi="Cambria Math"/>
           </w:rPr>
-          <m:t xml:space="preserve">+</m:t>
+          <m:t xml:space="preserve"> + </m:t>
         </m:r>
         <m:nary>
           <m:naryPr>
@@ -8035,43 +7665,6 @@
               </w:rPr>
               <m:t xml:space="preserve">k</m:t>
             </m:r>
-            <m:r>
-              <m:rPr>
-                <m:sty m:val="p"/>
-              </m:rPr>
-              <w:rPr>
-                <w:rFonts w:ascii="Cambria Math" w:hAnsi="Cambria Math"/>
-              </w:rPr>
-              <m:t xml:space="preserve">≠</m:t>
-            </m:r>
-            <m:sSub>
-              <m:sSubPr>
-                <m:ctrlPr>
-                  <w:rPr>
-                    <w:rFonts w:ascii="Cambria Math" w:hAnsi="Cambria Math"/>
-                  </w:rPr>
-                </m:ctrlPr>
-              </m:sSubPr>
-              <m:e>
-                <m:r>
-                  <w:rPr>
-                    <w:rFonts w:ascii="Cambria Math" w:hAnsi="Cambria Math"/>
-                  </w:rPr>
-                  <m:t xml:space="preserve">k</m:t>
-                </m:r>
-              </m:e>
-              <m:sub>
-                <m:r>
-                  <m:rPr>
-                    <m:sty m:val="p"/>
-                  </m:rPr>
-                  <w:rPr>
-                    <w:rFonts w:ascii="Cambria Math" w:hAnsi="Cambria Math"/>
-                  </w:rPr>
-                  <m:t xml:space="preserve">0</m:t>
-                </m:r>
-              </m:sub>
-            </m:sSub>
           </m:sub>
           <m:sup/>
           <m:e>
@@ -8107,7 +7700,7 @@
               <w:rPr>
                 <w:rFonts w:ascii="Cambria Math" w:hAnsi="Cambria Math"/>
               </w:rPr>
-              <m:t xml:space="preserve">⋅</m:t>
+              <m:t xml:space="preserve">(</m:t>
             </m:r>
             <m:sSub>
               <m:sSubPr>
@@ -8141,8 +7734,33 @@
               <w:rPr>
                 <w:rFonts w:ascii="Cambria Math" w:hAnsi="Cambria Math"/>
               </w:rPr>
-              <m:t xml:space="preserve">⋅</m:t>
+              <m:t xml:space="preserve"> × </m:t>
             </m:r>
+            <m:sSub>
+              <m:sSubPr>
+                <m:ctrlPr>
+                  <w:rPr>
+                    <w:rFonts w:ascii="Cambria Math" w:hAnsi="Cambria Math"/>
+                  </w:rPr>
+                </m:ctrlPr>
+              </m:sSubPr>
+              <m:e>
+                <m:r>
+                  <w:rPr>
+                    <w:rFonts w:ascii="Cambria Math" w:hAnsi="Cambria Math"/>
+                  </w:rPr>
+                  <m:t xml:space="preserve">T</m:t>
+                </m:r>
+              </m:e>
+              <m:sub>
+                <m:r>
+                  <w:rPr>
+                    <w:rFonts w:ascii="Cambria Math" w:hAnsi="Cambria Math"/>
+                  </w:rPr>
+                  <m:t xml:space="preserve">kt</m:t>
+                </m:r>
+              </m:sub>
+            </m:sSub>
             <m:r>
               <m:rPr>
                 <m:sty m:val="p"/>
@@ -8150,37 +7768,7 @@
               <w:rPr>
                 <w:rFonts w:ascii="Cambria Math" w:hAnsi="Cambria Math"/>
               </w:rPr>
-              <m:t xml:space="preserve">1[</m:t>
-            </m:r>
-            <m:r>
-              <w:rPr>
-                <w:rFonts w:ascii="Cambria Math" w:hAnsi="Cambria Math"/>
-              </w:rPr>
-              <m:t xml:space="preserve">t</m:t>
-            </m:r>
-            <m:r>
-              <m:rPr>
-                <m:sty m:val="p"/>
-              </m:rPr>
-              <w:rPr>
-                <w:rFonts w:ascii="Cambria Math" w:hAnsi="Cambria Math"/>
-              </w:rPr>
-              <m:t xml:space="preserve">=</m:t>
-            </m:r>
-            <m:r>
-              <w:rPr>
-                <w:rFonts w:ascii="Cambria Math" w:hAnsi="Cambria Math"/>
-              </w:rPr>
-              <m:t xml:space="preserve">k</m:t>
-            </m:r>
-            <m:r>
-              <m:rPr>
-                <m:sty m:val="p"/>
-              </m:rPr>
-              <w:rPr>
-                <w:rFonts w:ascii="Cambria Math" w:hAnsi="Cambria Math"/>
-              </w:rPr>
-              <m:t xml:space="preserve">]</m:t>
+              <m:t xml:space="preserve">)</m:t>
             </m:r>
           </m:e>
         </m:nary>
@@ -8191,129 +7779,7 @@
           <w:rPr>
             <w:rFonts w:ascii="Cambria Math" w:hAnsi="Cambria Math"/>
           </w:rPr>
-          <m:t xml:space="preserve">+</m:t>
-        </m:r>
-        <m:sSub>
-          <m:sSubPr>
-            <m:ctrlPr>
-              <w:rPr>
-                <w:rFonts w:ascii="Cambria Math" w:hAnsi="Cambria Math"/>
-              </w:rPr>
-            </m:ctrlPr>
-          </m:sSubPr>
-          <m:e>
-            <m:r>
-              <w:rPr>
-                <w:rFonts w:ascii="Cambria Math" w:hAnsi="Cambria Math"/>
-              </w:rPr>
-              <m:t xml:space="preserve">δ</m:t>
-            </m:r>
-          </m:e>
-          <m:sub>
-            <m:r>
-              <m:rPr>
-                <m:sty m:val="p"/>
-              </m:rPr>
-              <w:rPr>
-                <w:rFonts w:ascii="Cambria Math" w:hAnsi="Cambria Math"/>
-              </w:rPr>
-              <m:t xml:space="preserve">pre</m:t>
-            </m:r>
-          </m:sub>
-        </m:sSub>
-        <m:r>
-          <m:rPr>
-            <m:sty m:val="p"/>
-          </m:rPr>
-          <w:rPr>
-            <w:rFonts w:ascii="Cambria Math" w:hAnsi="Cambria Math"/>
-          </w:rPr>
-          <m:t xml:space="preserve">⋅</m:t>
-        </m:r>
-        <m:sSub>
-          <m:sSubPr>
-            <m:ctrlPr>
-              <w:rPr>
-                <w:rFonts w:ascii="Cambria Math" w:hAnsi="Cambria Math"/>
-              </w:rPr>
-            </m:ctrlPr>
-          </m:sSubPr>
-          <m:e>
-            <m:r>
-              <w:rPr>
-                <w:rFonts w:ascii="Cambria Math" w:hAnsi="Cambria Math"/>
-              </w:rPr>
-              <m:t xml:space="preserve">D</m:t>
-            </m:r>
-          </m:e>
-          <m:sub>
-            <m:r>
-              <w:rPr>
-                <w:rFonts w:ascii="Cambria Math" w:hAnsi="Cambria Math"/>
-              </w:rPr>
-              <m:t xml:space="preserve">i</m:t>
-            </m:r>
-          </m:sub>
-        </m:sSub>
-        <m:r>
-          <m:rPr>
-            <m:sty m:val="p"/>
-          </m:rPr>
-          <w:rPr>
-            <w:rFonts w:ascii="Cambria Math" w:hAnsi="Cambria Math"/>
-          </w:rPr>
-          <m:t xml:space="preserve">⋅</m:t>
-        </m:r>
-        <m:r>
-          <m:rPr>
-            <m:sty m:val="p"/>
-          </m:rPr>
-          <w:rPr>
-            <w:rFonts w:ascii="Cambria Math" w:hAnsi="Cambria Math"/>
-          </w:rPr>
-          <m:t xml:space="preserve">1[</m:t>
-        </m:r>
-        <m:r>
-          <w:rPr>
-            <w:rFonts w:ascii="Cambria Math" w:hAnsi="Cambria Math"/>
-          </w:rPr>
-          <m:t xml:space="preserve">t</m:t>
-        </m:r>
-        <m:r>
-          <m:rPr>
-            <m:sty m:val="p"/>
-          </m:rPr>
-          <w:rPr>
-            <w:rFonts w:ascii="Cambria Math" w:hAnsi="Cambria Math"/>
-          </w:rPr>
-          <m:t xml:space="preserve">&lt;</m:t>
-        </m:r>
-        <m:r>
-          <m:rPr>
-            <m:sty m:val="p"/>
-          </m:rPr>
-          <w:rPr>
-            <w:rFonts w:ascii="Cambria Math" w:hAnsi="Cambria Math"/>
-          </w:rPr>
-          <m:t xml:space="preserve">1/2024</m:t>
-        </m:r>
-        <m:r>
-          <m:rPr>
-            <m:sty m:val="p"/>
-          </m:rPr>
-          <w:rPr>
-            <w:rFonts w:ascii="Cambria Math" w:hAnsi="Cambria Math"/>
-          </w:rPr>
-          <m:t xml:space="preserve">]</m:t>
-        </m:r>
-        <m:r>
-          <m:rPr>
-            <m:sty m:val="p"/>
-          </m:rPr>
-          <w:rPr>
-            <w:rFonts w:ascii="Cambria Math" w:hAnsi="Cambria Math"/>
-          </w:rPr>
-          <m:t xml:space="preserve">+</m:t>
+          <m:t xml:space="preserve"> + </m:t>
         </m:r>
         <m:sSub>
           <m:sSubPr>
@@ -8336,22 +7802,7 @@
               <w:rPr>
                 <w:rFonts w:ascii="Cambria Math" w:hAnsi="Cambria Math"/>
               </w:rPr>
-              <m:t xml:space="preserve">i</m:t>
-            </m:r>
-            <m:r>
-              <m:rPr>
-                <m:sty m:val="p"/>
-              </m:rPr>
-              <w:rPr>
-                <w:rFonts w:ascii="Cambria Math" w:hAnsi="Cambria Math"/>
-              </w:rPr>
-              <m:t xml:space="preserve">,</m:t>
-            </m:r>
-            <m:r>
-              <w:rPr>
-                <w:rFonts w:ascii="Cambria Math" w:hAnsi="Cambria Math"/>
-              </w:rPr>
-              <m:t xml:space="preserve">t</m:t>
+              <m:t xml:space="preserve">it</m:t>
             </m:r>
           </m:sub>
         </m:sSub>
@@ -8367,23 +7818,23 @@
         <w:pStyle w:val="FirstParagraph"/>
       </w:pPr>
       <w:r>
-        <w:t xml:space="preserve">trong đó k, khác với k chỉ sàn ở phương trình (1), chạy từ tháng 1/2024 đến tháng 12/2028, các tháng trước 1/2024 được gộp vào một biến giả chung, </w:t>
+        <w:t xml:space="preserve">trong đó </w:t>
       </w:r>
       <w:r>
         <w:rPr>
           <w:i/>
           <w:iCs/>
         </w:rPr>
-        <w:t xml:space="preserve">k</w:t>
+        <w:t xml:space="preserve">T</w:t>
       </w:r>
       <w:r>
         <w:rPr>
           <w:vertAlign w:val="subscript"/>
         </w:rPr>
-        <w:t xml:space="preserve">0</w:t>
-      </w:r>
-      <w:r>
-        <w:t xml:space="preserve"> là tháng 6/2025, tức tháng gốc, và 1[t = k] bằng 1 nếu tháng t là tháng k. Các hệ số </w:t>
+        <w:t xml:space="preserve">kt</w:t>
+      </w:r>
+      <w:r>
+        <w:t xml:space="preserve"> bằng 1 nếu tháng t là tháng k, với k chạy từ tháng 1/2024 đến tháng 12/2028 và bỏ tháng 6/2025 làm tháng gốc; các tháng trước 1/2024 được gộp thành một nhóm. Các hệ số </w:t>
       </w:r>
       <w:r>
         <w:rPr>
@@ -8399,7 +7850,14 @@
         <w:t xml:space="preserve">k</w:t>
       </w:r>
       <w:r>
-        <w:t xml:space="preserve"> trong giai đoạn chuyển tiếp cho biết phản ứng trước sự kiện. Đề tài kiểm định đồng thời giả thuyết các hệ số δ</w:t>
+        <w:t xml:space="preserve"> trong giai đoạn chuyển tiếp cho biết phản ứng trước sự kiện. Đề tài kiểm định đồng thời giả thuyết các hệ số </w:t>
+      </w:r>
+      <w:r>
+        <w:rPr>
+          <w:i/>
+          <w:iCs/>
+        </w:rPr>
+        <w:t xml:space="preserve">δ</w:t>
       </w:r>
       <w:r>
         <w:rPr>
@@ -8410,14 +7868,151 @@
       <w:r>
         <w:t xml:space="preserve"> từ tháng 1/2024 đến tháng 5/2025 bằng 0. Độ nhạy của kết luận trước các vi phạm xu hướng song song được đánh giá theo Rambachan và Roth (2023). Vì giữa tháng gốc và giai đoạn sau có 18 tháng chuyển tiếp, khoảng tin cậy theo cách này có thể rất rộng.</w:t>
       </w:r>
+    </w:p>
+    <w:p>
+      <w:pPr>
+        <w:pStyle w:val="FirstParagraph"/>
+      </w:pPr>
+      <w:r>
+        <w:t xml:space="preserve">Việc chuyển sàn đổi nhiều quy tắc cùng lúc, trong đó ba quy tắc tác động mạnh yếu khác nhau tùy cổ phiếu: biên độ hẹp lại chỉ ràng buộc mã thường có lợi suất ngày lớn; bước giá nhỏ đi chủ yếu ở mã giá thấp; việc vào VN-Index và các chỉ số khác của HOSE tạo áp lực cầu lớn hơn ở mã có vốn hóa lớn so với giá trị giao dịch [CẦN XÁC MINH cách HOSE xử lý mã chuyển sàn trong các chỉ số].</w:t>
+      </w:r>
+    </w:p>
+    <w:p>
+      <w:pPr>
+        <w:pStyle w:val="BodyText"/>
+      </w:pPr>
+      <w:r>
+        <w:t xml:space="preserve">Ba mức chịu cú sốc tương ứng được đo bằng dữ liệu đến ngày 30/6/2025: tỷ lệ ngày có lợi suất tuyệt đối từ 7% đến dưới 10%; nghịch đảo của giá đóng cửa bình quân; và tỷ số giữa vốn hóa toàn phần và giá trị giao dịch bình quân ngày, vì VN-Index không điều chỉnh tỷ lệ tự do chuyển nhượng (Sở Giao dịch Chứng khoán Thành phố Hồ Chí Minh, 2026).</w:t>
+      </w:r>
+    </w:p>
+    <w:p>
+      <w:pPr>
+        <w:pStyle w:val="FirstParagraph"/>
+      </w:pPr>
+      <w:r>
+        <w:t xml:space="preserve">Bộ quy tắc của FTSE Russell coi cả HOSE và HNX là sàn đủ điều kiện ở Việt Nam (FTSE Russell, 2026a), nên việc đổi sàn tự nó không thay đổi tư cách được sàng lọc của một mã và không được coi là một kênh tác động qua chỉ số FTSE. Danh sách cổ phiếu đủ điều kiện, lập với dữ liệu đến ngày 30/6/2026, chỉ gồm mã niêm yết tại HOSE (FTSE Russell, 2026b) và được dùng để loại mã khỏi nhóm đối chứng; nếu mã chuyển sàn nào được đưa vào chỉ số ở các kỳ sau, δ được ước lượng thêm khi loại các mã này.</w:t>
+      </w:r>
+    </w:p>
+    <w:p>
+      <w:pPr>
+        <w:pStyle w:val="FirstParagraph"/>
+      </w:pPr>
+      <w:r>
+        <w:t xml:space="preserve">Phương trình (5) được mở rộng bằng các số hạng </w:t>
+      </w:r>
+      <w:r>
+        <w:rPr>
+          <w:i/>
+          <w:iCs/>
+        </w:rPr>
+        <w:t xml:space="preserve">D</w:t>
+      </w:r>
       <w:r>
         <w:rPr>
           <w:vertAlign w:val="subscript"/>
         </w:rPr>
-        <w:t xml:space="preserve"/>
-      </w:r>
-      <w:r>
-        <w:t xml:space="preserve"/>
+        <w:t xml:space="preserve">i</w:t>
+      </w:r>
+      <w:r>
+        <w:t xml:space="preserve"> × </w:t>
+      </w:r>
+      <w:r>
+        <w:rPr>
+          <w:i/>
+          <w:iCs/>
+        </w:rPr>
+        <w:t xml:space="preserve">Post</w:t>
+      </w:r>
+      <w:r>
+        <w:rPr>
+          <w:vertAlign w:val="subscript"/>
+        </w:rPr>
+        <w:t xml:space="preserve">t</w:t>
+      </w:r>
+      <w:r>
+        <w:t xml:space="preserve"> × </w:t>
+      </w:r>
+      <w:r>
+        <w:rPr>
+          <w:i/>
+          <w:iCs/>
+        </w:rPr>
+        <w:t xml:space="preserve">E</w:t>
+      </w:r>
+      <w:r>
+        <w:rPr>
+          <w:vertAlign w:val="subscript"/>
+        </w:rPr>
+        <w:t xml:space="preserve">si</w:t>
+      </w:r>
+      <w:r>
+        <w:t xml:space="preserve">, trong đó </w:t>
+      </w:r>
+      <w:r>
+        <w:rPr>
+          <w:i/>
+          <w:iCs/>
+        </w:rPr>
+        <w:t xml:space="preserve">E</w:t>
+      </w:r>
+      <w:r>
+        <w:rPr>
+          <w:vertAlign w:val="subscript"/>
+        </w:rPr>
+        <w:t xml:space="preserve">si</w:t>
+      </w:r>
+      <w:r>
+        <w:t xml:space="preserve"> là mức chịu cú sốc s của cổ phiếu i, trừ trung bình và chia cho độ lệch chuẩn giữa các mã chuyển sàn, nên </w:t>
+      </w:r>
+      <w:r>
+        <w:rPr>
+          <w:i/>
+          <w:iCs/>
+        </w:rPr>
+        <w:t xml:space="preserve">δ</w:t>
+      </w:r>
+      <w:r>
+        <w:t xml:space="preserve"> là tác động tại mức chịu cú sốc trung bình. Các số hạng </w:t>
+      </w:r>
+      <w:r>
+        <w:rPr>
+          <w:i/>
+          <w:iCs/>
+        </w:rPr>
+        <w:t xml:space="preserve">E</w:t>
+      </w:r>
+      <w:r>
+        <w:rPr>
+          <w:vertAlign w:val="subscript"/>
+        </w:rPr>
+        <w:t xml:space="preserve">si</w:t>
+      </w:r>
+      <w:r>
+        <w:t xml:space="preserve"> × </w:t>
+      </w:r>
+      <w:r>
+        <w:rPr>
+          <w:i/>
+          <w:iCs/>
+        </w:rPr>
+        <w:t xml:space="preserve">τ</w:t>
+      </w:r>
+      <w:r>
+        <w:rPr>
+          <w:vertAlign w:val="subscript"/>
+        </w:rPr>
+        <w:t xml:space="preserve">t</w:t>
+      </w:r>
+      <w:r>
+        <w:t xml:space="preserve"> cho mỗi mức chịu cú sốc một hiệu ứng theo tháng riêng, ước lượng trên mã đối chứng đo được cùng thước đo: mã UPCoM với biên độ, mã HOSE với bước giá và chỉ số. Nếu cổ phiếu UPCoM chuyển sang HOSE trước hoặc trong cửa sổ sau (mục 4.3.10), mức chịu cú sốc biên độ của mọi mã được đo bằng tỷ lệ ngày có lợi suất tuyệt đối từ ngưỡng chung trở lên và hiệu ứng theo tháng tương ứng được ước lượng trên mã HOSE đối chứng; thước đo này chỉ đại diện gần đúng cho mức chịu ràng buộc của biên độ.</w:t>
+      </w:r>
+    </w:p>
+    <w:p>
+      <w:pPr>
+        <w:pStyle w:val="BodyText"/>
+      </w:pPr>
+      <w:r>
+        <w:t xml:space="preserve">Giả định nhận dạng là: nếu không chuyển sàn, chênh lệch thanh khoản giữa mã chịu cú sốc mạnh và mã chịu cú sốc yếu trong nhóm chuyển sàn sẽ biến động như ở nhóm đối chứng; giả định này được kiểm tra bằng các hệ số trước sự kiện. Vì các mức chịu cú sốc có thể tương quan với nhau và với quy mô, hệ số tương tác không đo riêng tác động của từng quy tắc; mô hình có thêm tương tác với quy mô và với logarit Amihud ban đầu.</w:t>
       </w:r>
     </w:p>
     <w:p>
@@ -8425,15 +8020,7 @@
         <w:pStyle w:val="FirstParagraph"/>
       </w:pPr>
       <w:r>
-        <w:t xml:space="preserve">Việc chuyển sàn đổi nhiều quy tắc cùng lúc, trong đó ba quy tắc tác động mạnh yếu khác nhau tùy cổ phiếu: biên độ hẹp lại chỉ ràng buộc mã thường có lợi suất ngày lớn; bước giá nhỏ đi chủ yếu ở mã giá thấp; việc vào VN-Index và các chỉ số khác của HOSE tạo áp lực cầu lớn hơn ở mã có vốn hóa lớn so với giá trị giao dịch [CẦN XÁC MINH cách HOSE xử lý mã chuyển sàn trong các chỉ số].</w:t>
-      </w:r>
-    </w:p>
-    <w:p>
-      <w:pPr>
-        <w:pStyle w:val="BodyText"/>
-      </w:pPr>
-      <w:r>
-        <w:t xml:space="preserve">Ba mức chịu cú sốc tương ứng được đo bằng dữ liệu đến ngày 30/6/2025: tỷ lệ ngày có lợi suất tuyệt đối từ 7% đến dưới 10%; nghịch đảo của giá đóng cửa bình quân; và tỷ số giữa vốn hóa toàn phần và giá trị giao dịch bình quân ngày, vì VN-Index không điều chỉnh tỷ lệ tự do chuyển nhượng (Sở Giao dịch Chứng khoán Thành phố Hồ Chí Minh, 2026).</w:t>
+        <w:t xml:space="preserve">Mỗi hệ số tương tác được suy luận như δ, vì sai số chuẩn phân cụm theo cổ phiếu bác bỏ quá thường xuyên khi cú sốc chung theo tháng tác động mạnh hơn lên mã chịu cú sốc mạnh: với từng tháng, đề tài lấy hệ số góc của logarit Amihud theo mức chịu cú sốc ở mã chuyển sàn trừ hệ số góc ở mã đối chứng, rồi áp dụng bootstrap tự hồi quy cho chuỗi này. Các hệ số tương tác, kể cả theo trụ sở, là phân tích phụ đăng ký trước, không đưa vào thủ tục Holm.</w:t>
       </w:r>
     </w:p>
     <w:p>
@@ -8441,7 +8028,7 @@
         <w:pStyle w:val="FirstParagraph"/>
       </w:pPr>
       <w:r>
-        <w:t xml:space="preserve">Bộ quy tắc của FTSE Russell coi cả HOSE và HNX là sàn đủ điều kiện ở Việt Nam (FTSE Russell, 2026a), nên việc đổi sàn tự nó không thay đổi tư cách được sàng lọc của một mã và không được coi là một kênh tác động qua chỉ số FTSE. Danh sách cổ phiếu đủ điều kiện, lập với dữ liệu đến ngày 30/6/2026, chỉ gồm mã niêm yết tại HOSE (FTSE Russell, 2026b) và được dùng để loại mã khỏi nhóm đối chứng; nếu mã chuyển sàn nào được đưa vào chỉ số ở các kỳ sau, δ được ước lượng thêm khi loại các mã này.</w:t>
+        <w:t xml:space="preserve">Phân tích theo trụ sở kiểm tra xem việc chuyển sàn có tác động khác nhau đến doanh nghiệp có trụ sở tại Hà Nội và doanh nghiệp ở nơi khác hay không. Văn liệu cho thấy nhà quản lý quỹ ưa nắm giữ cổ phiếu của doanh nghiệp có trụ sở gần mình (Coval &amp; Moskowitz, 1999) và thanh khoản của cổ phiếu phụ thuộc vào vị trí trụ sở (Loughran &amp; Schultz, 2005) [CẦN ĐỐI CHIẾU bản gốc của hai bài], nhưng hai bài này nói về khoảng cách giữa nhà đầu tư và doanh nghiệp, không nói về vị trí của sàn. Kênh mà đề tài kiểm tra là sự chú ý và thông tin gắn với nơi đặt sàn: nếu kênh này có thật, cổ phiếu của doanh nghiệp có trụ sở tại Hà Nội được lợi ít hơn khi chuyển sang HOSE.</w:t>
       </w:r>
     </w:p>
     <w:p>
@@ -8449,7 +8036,14 @@
         <w:pStyle w:val="FirstParagraph"/>
       </w:pPr>
       <w:r>
-        <w:t xml:space="preserve">Phương trình (5) được mở rộng bằng các số hạng D</w:t>
+        <w:t xml:space="preserve">Chênh lệch này được ước lượng bằng tương tác giữa </w:t>
+      </w:r>
+      <w:r>
+        <w:rPr>
+          <w:i/>
+          <w:iCs/>
+        </w:rPr>
+        <w:t xml:space="preserve">D</w:t>
       </w:r>
       <w:r>
         <w:rPr>
@@ -8458,120 +8052,14 @@
         <w:t xml:space="preserve">i</w:t>
       </w:r>
       <w:r>
-        <w:t xml:space="preserve">·Post</w:t>
-      </w:r>
-      <w:r>
-        <w:rPr>
-          <w:vertAlign w:val="subscript"/>
-        </w:rPr>
-        <w:t xml:space="preserve">t</w:t>
-      </w:r>
-      <w:r>
-        <w:t xml:space="preserve">·E</w:t>
-      </w:r>
-      <w:r>
-        <w:rPr>
-          <w:vertAlign w:val="subscript"/>
-        </w:rPr>
-        <w:t xml:space="preserve">s</w:t>
-      </w:r>
-      <w:r>
-        <w:t xml:space="preserve">,</w:t>
-      </w:r>
-      <w:r>
-        <w:rPr>
-          <w:vertAlign w:val="subscript"/>
-        </w:rPr>
-        <w:t xml:space="preserve">i</w:t>
-      </w:r>
-      <w:r>
-        <w:t xml:space="preserve">, trong đó E</w:t>
-      </w:r>
-      <w:r>
-        <w:rPr>
-          <w:vertAlign w:val="subscript"/>
-        </w:rPr>
-        <w:t xml:space="preserve">s</w:t>
-      </w:r>
-      <w:r>
-        <w:t xml:space="preserve">,</w:t>
-      </w:r>
-      <w:r>
-        <w:rPr>
-          <w:vertAlign w:val="subscript"/>
-        </w:rPr>
-        <w:t xml:space="preserve">i</w:t>
-      </w:r>
-      <w:r>
-        <w:t xml:space="preserve"> là mức chịu cú sốc s của cổ phiếu i, trừ trung bình và chia cho độ lệch chuẩn giữa các mã chuyển sàn, nên δ là tác động tại mức chịu cú sốc trung bình. Các số hạng E</w:t>
-      </w:r>
-      <w:r>
-        <w:rPr>
-          <w:vertAlign w:val="subscript"/>
-        </w:rPr>
-        <w:t xml:space="preserve">s</w:t>
-      </w:r>
-      <w:r>
-        <w:t xml:space="preserve">,</w:t>
-      </w:r>
-      <w:r>
-        <w:rPr>
-          <w:vertAlign w:val="subscript"/>
-        </w:rPr>
-        <w:t xml:space="preserve">i</w:t>
-      </w:r>
-      <w:r>
-        <w:t xml:space="preserve">·τ</w:t>
-      </w:r>
-      <w:r>
-        <w:rPr>
-          <w:vertAlign w:val="subscript"/>
-        </w:rPr>
-        <w:t xml:space="preserve">t</w:t>
-      </w:r>
-      <w:r>
-        <w:t xml:space="preserve"> cho mỗi mức chịu cú sốc một hiệu ứng theo tháng riêng, ước lượng trên mã đối chứng đo được cùng thước đo: mã UPCoM với biên độ, mã HOSE với bước giá và chỉ số. Nếu cổ phiếu UPCoM chuyển sang HOSE trước hoặc trong cửa sổ sau (mục 4.3.10), mức chịu cú sốc biên độ của mọi mã được đo bằng tỷ lệ ngày có lợi suất tuyệt đối từ ngưỡng chung trở lên và hiệu ứng theo tháng tương ứng được ước lượng trên mã HOSE đối chứng; thước đo này chỉ đại diện gần đúng cho mức chịu ràng buộc của biên độ.</w:t>
-      </w:r>
-    </w:p>
-    <w:p>
-      <w:pPr>
-        <w:pStyle w:val="BodyText"/>
-      </w:pPr>
-      <w:r>
-        <w:t xml:space="preserve">Giả định nhận dạng là: nếu không chuyển sàn, chênh lệch thanh khoản giữa mã chịu cú sốc mạnh và mã chịu cú sốc yếu trong nhóm chuyển sàn sẽ biến động như ở nhóm đối chứng; giả định này được kiểm tra bằng các hệ số trước sự kiện. Vì các mức chịu cú sốc có thể tương quan với nhau và với quy mô, hệ số tương tác không đo riêng tác động của từng quy tắc; mô hình có thêm tương tác với quy mô và với logarit Amihud ban đầu.</w:t>
-      </w:r>
-    </w:p>
-    <w:p>
-      <w:pPr>
-        <w:pStyle w:val="FirstParagraph"/>
-      </w:pPr>
-      <w:r>
-        <w:t xml:space="preserve">Mỗi hệ số tương tác được suy luận như δ, vì sai số chuẩn phân cụm theo cổ phiếu bác bỏ quá thường xuyên khi cú sốc chung theo tháng tác động mạnh hơn lên mã chịu cú sốc mạnh: với từng tháng, đề tài lấy hệ số góc của logarit Amihud theo mức chịu cú sốc ở mã chuyển sàn trừ hệ số góc ở mã đối chứng, rồi áp dụng bootstrap tự hồi quy cho chuỗi này. Các hệ số tương tác, kể cả theo trụ sở, là phân tích phụ đăng ký trước, không đưa vào thủ tục Holm.</w:t>
-      </w:r>
-    </w:p>
-    <w:p>
-      <w:pPr>
-        <w:pStyle w:val="FirstParagraph"/>
-      </w:pPr>
-      <w:r>
-        <w:t xml:space="preserve">Phân tích theo trụ sở kiểm tra xem việc chuyển sàn có tác động khác nhau đến doanh nghiệp có trụ sở tại Hà Nội và doanh nghiệp ở nơi khác hay không. Văn liệu cho thấy nhà quản lý quỹ ưa nắm giữ cổ phiếu của doanh nghiệp có trụ sở gần mình (Coval &amp; Moskowitz, 1999) và thanh khoản của cổ phiếu phụ thuộc vào vị trí trụ sở (Loughran &amp; Schultz, 2005) [CẦN ĐỐI CHIẾU bản gốc của hai bài], nhưng hai bài này nói về khoảng cách giữa nhà đầu tư và doanh nghiệp, không nói về vị trí của sàn. Kênh mà đề tài kiểm tra là sự chú ý và thông tin gắn với nơi đặt sàn: nếu kênh này có thật, cổ phiếu của doanh nghiệp có trụ sở tại Hà Nội được lợi ít hơn khi chuyển sang HOSE.</w:t>
-      </w:r>
-    </w:p>
-    <w:p>
-      <w:pPr>
-        <w:pStyle w:val="FirstParagraph"/>
-      </w:pPr>
-      <w:r>
-        <w:t xml:space="preserve">Chênh lệch này được ước lượng bằng tương tác giữa D</w:t>
-      </w:r>
-      <w:r>
-        <w:rPr>
-          <w:vertAlign w:val="subscript"/>
-        </w:rPr>
-        <w:t xml:space="preserve">i</w:t>
-      </w:r>
-      <w:r>
-        <w:t xml:space="preserve">·Post</w:t>
+        <w:t xml:space="preserve"> × </w:t>
+      </w:r>
+      <w:r>
+        <w:rPr>
+          <w:i/>
+          <w:iCs/>
+        </w:rPr>
+        <w:t xml:space="preserve">Post</w:t>
       </w:r>
       <w:r>
         <w:rPr>
@@ -8686,22 +8174,7 @@
               <w:rPr>
                 <w:rFonts w:ascii="Cambria Math" w:hAnsi="Cambria Math"/>
               </w:rPr>
-              <m:t xml:space="preserve">i</m:t>
-            </m:r>
-            <m:r>
-              <m:rPr>
-                <m:sty m:val="p"/>
-              </m:rPr>
-              <w:rPr>
-                <w:rFonts w:ascii="Cambria Math" w:hAnsi="Cambria Math"/>
-              </w:rPr>
-              <m:t xml:space="preserve">,</m:t>
-            </m:r>
-            <m:r>
-              <w:rPr>
-                <w:rFonts w:ascii="Cambria Math" w:hAnsi="Cambria Math"/>
-              </w:rPr>
-              <m:t xml:space="preserve">t</m:t>
+              <m:t xml:space="preserve">it</m:t>
             </m:r>
           </m:sub>
         </m:sSub>
@@ -8712,7 +8185,7 @@
           <w:rPr>
             <w:rFonts w:ascii="Cambria Math" w:hAnsi="Cambria Math"/>
           </w:rPr>
-          <m:t xml:space="preserve">=</m:t>
+          <m:t xml:space="preserve"> = </m:t>
         </m:r>
         <m:sSub>
           <m:sSubPr>
@@ -8746,7 +8219,7 @@
           <w:rPr>
             <w:rFonts w:ascii="Cambria Math" w:hAnsi="Cambria Math"/>
           </w:rPr>
-          <m:t xml:space="preserve">+</m:t>
+          <m:t xml:space="preserve"> + </m:t>
         </m:r>
         <m:sSub>
           <m:sSubPr>
@@ -8780,7 +8253,7 @@
           <w:rPr>
             <w:rFonts w:ascii="Cambria Math" w:hAnsi="Cambria Math"/>
           </w:rPr>
-          <m:t xml:space="preserve">+</m:t>
+          <m:t xml:space="preserve"> + </m:t>
         </m:r>
         <m:r>
           <w:rPr>
@@ -8795,7 +8268,7 @@
           <w:rPr>
             <w:rFonts w:ascii="Cambria Math" w:hAnsi="Cambria Math"/>
           </w:rPr>
-          <m:t xml:space="preserve">⋅</m:t>
+          <m:t xml:space="preserve">·</m:t>
         </m:r>
         <m:sSub>
           <m:sSubPr>
@@ -8821,61 +8294,7 @@
               <w:rPr>
                 <w:rFonts w:ascii="Cambria Math" w:hAnsi="Cambria Math"/>
               </w:rPr>
-              <m:t xml:space="preserve">c</m:t>
-            </m:r>
-            <m:r>
-              <m:rPr>
-                <m:sty m:val="p"/>
-              </m:rPr>
-              <w:rPr>
-                <w:rFonts w:ascii="Cambria Math" w:hAnsi="Cambria Math"/>
-              </w:rPr>
-              <m:t xml:space="preserve">(</m:t>
-            </m:r>
-            <m:r>
-              <w:rPr>
-                <w:rFonts w:ascii="Cambria Math" w:hAnsi="Cambria Math"/>
-              </w:rPr>
-              <m:t xml:space="preserve">i</m:t>
-            </m:r>
-            <m:r>
-              <m:rPr>
-                <m:sty m:val="p"/>
-              </m:rPr>
-              <w:rPr>
-                <w:rFonts w:ascii="Cambria Math" w:hAnsi="Cambria Math"/>
-              </w:rPr>
-              <m:t xml:space="preserve">),</m:t>
-            </m:r>
-            <m:r>
-              <w:rPr>
-                <w:rFonts w:ascii="Cambria Math" w:hAnsi="Cambria Math"/>
-              </w:rPr>
-              <m:t xml:space="preserve">y</m:t>
-            </m:r>
-            <m:r>
-              <m:rPr>
-                <m:sty m:val="p"/>
-              </m:rPr>
-              <w:rPr>
-                <w:rFonts w:ascii="Cambria Math" w:hAnsi="Cambria Math"/>
-              </w:rPr>
-              <m:t xml:space="preserve">(</m:t>
-            </m:r>
-            <m:r>
-              <w:rPr>
-                <w:rFonts w:ascii="Cambria Math" w:hAnsi="Cambria Math"/>
-              </w:rPr>
-              <m:t xml:space="preserve">t</m:t>
-            </m:r>
-            <m:r>
-              <m:rPr>
-                <m:sty m:val="p"/>
-              </m:rPr>
-              <w:rPr>
-                <w:rFonts w:ascii="Cambria Math" w:hAnsi="Cambria Math"/>
-              </w:rPr>
-              <m:t xml:space="preserve">)−1</m:t>
+              <m:t xml:space="preserve">it</m:t>
             </m:r>
           </m:sub>
         </m:sSub>
@@ -8886,36 +8305,23 @@
           <w:rPr>
             <w:rFonts w:ascii="Cambria Math" w:hAnsi="Cambria Math"/>
           </w:rPr>
-          <m:t xml:space="preserve">+</m:t>
+          <m:t xml:space="preserve"> + </m:t>
         </m:r>
-        <m:sSup>
-          <m:sSupPr>
-            <m:ctrlPr>
-              <w:rPr>
-                <w:rFonts w:ascii="Cambria Math" w:hAnsi="Cambria Math"/>
-              </w:rPr>
-            </m:ctrlPr>
-          </m:sSupPr>
-          <m:e>
-            <m:r>
-              <w:rPr>
-                <w:rFonts w:ascii="Cambria Math" w:hAnsi="Cambria Math"/>
-              </w:rPr>
-              <m:t xml:space="preserve">λ</m:t>
-            </m:r>
-          </m:e>
-          <m:sup>
-            <m:r>
-              <m:rPr>
-                <m:sty m:val="p"/>
-              </m:rPr>
-              <w:rPr>
-                <w:rFonts w:ascii="Cambria Math" w:hAnsi="Cambria Math"/>
-              </w:rPr>
-              <m:t xml:space="preserve">′</m:t>
-            </m:r>
-          </m:sup>
-        </m:sSup>
+        <m:r>
+          <w:rPr>
+            <w:rFonts w:ascii="Cambria Math" w:hAnsi="Cambria Math"/>
+          </w:rPr>
+          <m:t xml:space="preserve">λ</m:t>
+        </m:r>
+        <m:r>
+          <m:rPr>
+            <m:sty m:val="p"/>
+          </m:rPr>
+          <w:rPr>
+            <w:rFonts w:ascii="Cambria Math" w:hAnsi="Cambria Math"/>
+          </w:rPr>
+          <m:t xml:space="preserve">·</m:t>
+        </m:r>
         <m:sSub>
           <m:sSubPr>
             <m:ctrlPr>
@@ -8937,61 +8343,7 @@
               <w:rPr>
                 <w:rFonts w:ascii="Cambria Math" w:hAnsi="Cambria Math"/>
               </w:rPr>
-              <m:t xml:space="preserve">c</m:t>
-            </m:r>
-            <m:r>
-              <m:rPr>
-                <m:sty m:val="p"/>
-              </m:rPr>
-              <w:rPr>
-                <w:rFonts w:ascii="Cambria Math" w:hAnsi="Cambria Math"/>
-              </w:rPr>
-              <m:t xml:space="preserve">(</m:t>
-            </m:r>
-            <m:r>
-              <w:rPr>
-                <w:rFonts w:ascii="Cambria Math" w:hAnsi="Cambria Math"/>
-              </w:rPr>
-              <m:t xml:space="preserve">i</m:t>
-            </m:r>
-            <m:r>
-              <m:rPr>
-                <m:sty m:val="p"/>
-              </m:rPr>
-              <w:rPr>
-                <w:rFonts w:ascii="Cambria Math" w:hAnsi="Cambria Math"/>
-              </w:rPr>
-              <m:t xml:space="preserve">),</m:t>
-            </m:r>
-            <m:r>
-              <w:rPr>
-                <w:rFonts w:ascii="Cambria Math" w:hAnsi="Cambria Math"/>
-              </w:rPr>
-              <m:t xml:space="preserve">y</m:t>
-            </m:r>
-            <m:r>
-              <m:rPr>
-                <m:sty m:val="p"/>
-              </m:rPr>
-              <w:rPr>
-                <w:rFonts w:ascii="Cambria Math" w:hAnsi="Cambria Math"/>
-              </w:rPr>
-              <m:t xml:space="preserve">(</m:t>
-            </m:r>
-            <m:r>
-              <w:rPr>
-                <w:rFonts w:ascii="Cambria Math" w:hAnsi="Cambria Math"/>
-              </w:rPr>
-              <m:t xml:space="preserve">t</m:t>
-            </m:r>
-            <m:r>
-              <m:rPr>
-                <m:sty m:val="p"/>
-              </m:rPr>
-              <w:rPr>
-                <w:rFonts w:ascii="Cambria Math" w:hAnsi="Cambria Math"/>
-              </w:rPr>
-              <m:t xml:space="preserve">)−1</m:t>
+              <m:t xml:space="preserve">it</m:t>
             </m:r>
           </m:sub>
         </m:sSub>
@@ -9002,7 +8354,7 @@
           <w:rPr>
             <w:rFonts w:ascii="Cambria Math" w:hAnsi="Cambria Math"/>
           </w:rPr>
-          <m:t xml:space="preserve">+</m:t>
+          <m:t xml:space="preserve"> + </m:t>
         </m:r>
         <m:sSub>
           <m:sSubPr>
@@ -9025,22 +8377,7 @@
               <w:rPr>
                 <w:rFonts w:ascii="Cambria Math" w:hAnsi="Cambria Math"/>
               </w:rPr>
-              <m:t xml:space="preserve">i</m:t>
-            </m:r>
-            <m:r>
-              <m:rPr>
-                <m:sty m:val="p"/>
-              </m:rPr>
-              <w:rPr>
-                <w:rFonts w:ascii="Cambria Math" w:hAnsi="Cambria Math"/>
-              </w:rPr>
-              <m:t xml:space="preserve">,</m:t>
-            </m:r>
-            <m:r>
-              <w:rPr>
-                <w:rFonts w:ascii="Cambria Math" w:hAnsi="Cambria Math"/>
-              </w:rPr>
-              <m:t xml:space="preserve">t</m:t>
+              <m:t xml:space="preserve">it</m:t>
             </m:r>
           </m:sub>
         </m:sSub>
@@ -9069,10 +8406,10 @@
         <w:rPr>
           <w:vertAlign w:val="subscript"/>
         </w:rPr>
-        <w:t xml:space="preserve">i,t</w:t>
-      </w:r>
-      <w:r>
-        <w:t xml:space="preserve"> là điểm GFCI chuẩn hóa thành điểm z trong từng kỳ. Đề tài chuẩn hóa vì điểm GFCI được ước lượng lại mỗi kỳ và số trung tâm thay đổi giữa các kỳ. </w:t>
+        <w:t xml:space="preserve">it</w:t>
+      </w:r>
+      <w:r>
+        <w:t xml:space="preserve"> là điểm GFCI của trung tâm i ở kỳ t, chuẩn hóa thành điểm z trong từng kỳ vì điểm GFCI được ước lượng lại mỗi kỳ và số trung tâm thay đổi giữa các kỳ. </w:t>
       </w:r>
       <w:r>
         <w:rPr>
@@ -9085,10 +8422,10 @@
         <w:rPr>
           <w:vertAlign w:val="subscript"/>
         </w:rPr>
-        <w:t xml:space="preserve">c(i),y(t)−1</w:t>
-      </w:r>
-      <w:r>
-        <w:t xml:space="preserve"> là chỉ báo phát triển thị trường cổ phiếu của quốc gia c(i) chứa trung tâm i trong năm liền trước năm y(t) của kỳ t, gộp từ tỷ lệ vòng quay và vốn hóa trên GDP (Čihák và cộng sự, 2012); </w:t>
+        <w:t xml:space="preserve">it</w:t>
+      </w:r>
+      <w:r>
+        <w:t xml:space="preserve"> là chỉ báo phát triển thị trường cổ phiếu, gộp từ tỷ lệ vòng quay và vốn hóa trên GDP (Čihák và cộng sự, 2012), còn </w:t>
       </w:r>
       <w:r>
         <w:rPr>
@@ -9101,101 +8438,68 @@
         <w:rPr>
           <w:vertAlign w:val="subscript"/>
         </w:rPr>
-        <w:t xml:space="preserve">c(i),y(t)−1</w:t>
-      </w:r>
-      <w:r>
-        <w:t xml:space="preserve"> là véc-tơ gồm thu nhập bình quân đầu người và chỉ số quản trị nhà nước (Kaufmann và cộng sự, 2011); </w:t>
+        <w:t xml:space="preserve">it</w:t>
+      </w:r>
+      <w:r>
+        <w:t xml:space="preserve"> gồm thu nhập bình quân đầu người và chỉ số quản trị nhà nước (Kaufmann và cộng sự, 2011); cả hai được đo ở quốc gia chứa trung tâm i, trong năm liền trước kỳ t. </w:t>
       </w:r>
       <w:r>
         <w:rPr>
           <w:i/>
           <w:iCs/>
         </w:rPr>
-        <w:t xml:space="preserve">γ</w:t>
-      </w:r>
-      <w:r>
-        <w:rPr>
-          <w:vertAlign w:val="subscript"/>
-        </w:rPr>
-        <w:t xml:space="preserve">i</w:t>
-      </w:r>
-      <w:r>
-        <w:t xml:space="preserve"> và </w:t>
+        <w:t xml:space="preserve">λ</w:t>
+      </w:r>
+      <w:r>
+        <w:t xml:space="preserve"> là véc-tơ hệ số của </w:t>
       </w:r>
       <w:r>
         <w:rPr>
           <w:i/>
           <w:iCs/>
         </w:rPr>
-        <w:t xml:space="preserve">θ</w:t>
+        <w:t xml:space="preserve">W</w:t>
       </w:r>
       <w:r>
         <w:rPr>
           <w:vertAlign w:val="subscript"/>
         </w:rPr>
-        <w:t xml:space="preserve">t</w:t>
-      </w:r>
-      <w:r>
-        <w:t xml:space="preserve"> là hiệu ứng cố định theo trung tâm và theo kỳ. Nếu Cơ sở dữ liệu Phát triển Tài chính Toàn cầu không phủ các năm sau 2021, đề tài dùng số liệu của Liên đoàn các Sở Giao dịch Thế giới, sau khi kiểm tra độ phủ và điều khoản sử dụng.</w:t>
+        <w:t xml:space="preserve">it</w:t>
+      </w:r>
+      <w:r>
+        <w:t xml:space="preserve">; </w:t>
       </w:r>
       <w:r>
         <w:rPr>
           <w:i/>
           <w:iCs/>
         </w:rPr>
-        <w:t xml:space="preserve"/>
-      </w:r>
-      <w:r>
-        <w:t xml:space="preserve"/>
+        <w:t xml:space="preserve">γ</w:t>
+      </w:r>
+      <w:r>
+        <w:rPr>
+          <w:vertAlign w:val="subscript"/>
+        </w:rPr>
+        <w:t xml:space="preserve">i</w:t>
+      </w:r>
+      <w:r>
+        <w:t xml:space="preserve"> và </w:t>
       </w:r>
       <w:r>
         <w:rPr>
           <w:i/>
           <w:iCs/>
         </w:rPr>
-        <w:t xml:space="preserve"/>
-      </w:r>
-      <w:r>
-        <w:t xml:space="preserve"/>
-      </w:r>
-      <w:r>
-        <w:rPr>
-          <w:i/>
-          <w:iCs/>
-        </w:rPr>
-        <w:t xml:space="preserve"/>
-      </w:r>
-      <w:r>
-        <w:t xml:space="preserve"/>
-      </w:r>
-      <w:r>
-        <w:rPr>
-          <w:i/>
-          <w:iCs/>
-        </w:rPr>
-        <w:t xml:space="preserve"/>
-      </w:r>
-      <w:r>
-        <w:t xml:space="preserve"/>
+        <w:t xml:space="preserve">θ</w:t>
       </w:r>
       <w:r>
         <w:rPr>
           <w:vertAlign w:val="subscript"/>
         </w:rPr>
-        <w:t xml:space="preserve"/>
-      </w:r>
-      <w:r>
-        <w:t xml:space="preserve"/>
-      </w:r>
-      <w:r>
-        <w:rPr>
-          <w:i/>
-          <w:iCs/>
-        </w:rPr>
-        <w:t xml:space="preserve"/>
-      </w:r>
-      <w:r>
-        <w:t xml:space="preserve"/>
+        <w:t xml:space="preserve">t</w:t>
+      </w:r>
+      <w:r>
+        <w:t xml:space="preserve"> là hiệu ứng cố định theo trung tâm và theo kỳ. Nếu Cơ sở dữ liệu Phát triển Tài chính Toàn cầu không phủ các năm sau 2021, đề tài dùng số liệu của Liên đoàn các Sở Giao dịch Thế giới, sau khi kiểm tra độ phủ và điều khoản sử dụng.</w:t>
       </w:r>
     </w:p>
     <w:p>

</xml_diff>

<commit_message>
Vòng 14: bỏ dấu nhân trong công thức, viết liền theo kiểu kinh tế lượng
Co-Authored-By: Claude Opus 5.5 <noreply@anthropic.com>
Claude-Session: https://claude.ai/code/session_012s8WfVyLuhc473yaQuJygq
</commit_message>
<xml_diff>
--- a/outputs/round-14/de-cuong-v14-round-14.docx
+++ b/outputs/round-14/de-cuong-v14-round-14.docx
@@ -7245,15 +7245,6 @@
           </w:rPr>
           <m:t xml:space="preserve">δ</m:t>
         </m:r>
-        <m:r>
-          <m:rPr>
-            <m:sty m:val="p"/>
-          </m:rPr>
-          <w:rPr>
-            <w:rFonts w:ascii="Cambria Math" w:hAnsi="Cambria Math"/>
-          </w:rPr>
-          <m:t xml:space="preserve">(</m:t>
-        </m:r>
         <m:sSub>
           <m:sSubPr>
             <m:ctrlPr>
@@ -7279,15 +7270,6 @@
             </m:r>
           </m:sub>
         </m:sSub>
-        <m:r>
-          <m:rPr>
-            <m:sty m:val="p"/>
-          </m:rPr>
-          <w:rPr>
-            <w:rFonts w:ascii="Cambria Math" w:hAnsi="Cambria Math"/>
-          </w:rPr>
-          <m:t xml:space="preserve"> × </m:t>
-        </m:r>
         <m:sSub>
           <m:sSubPr>
             <m:ctrlPr>
@@ -7320,7 +7302,7 @@
           <w:rPr>
             <w:rFonts w:ascii="Cambria Math" w:hAnsi="Cambria Math"/>
           </w:rPr>
-          <m:t xml:space="preserve">) + </m:t>
+          <m:t xml:space="preserve"> + </m:t>
         </m:r>
         <m:sSub>
           <m:sSubPr>
@@ -7693,15 +7675,6 @@
                 </m:r>
               </m:sub>
             </m:sSub>
-            <m:r>
-              <m:rPr>
-                <m:sty m:val="p"/>
-              </m:rPr>
-              <w:rPr>
-                <w:rFonts w:ascii="Cambria Math" w:hAnsi="Cambria Math"/>
-              </w:rPr>
-              <m:t xml:space="preserve">(</m:t>
-            </m:r>
             <m:sSub>
               <m:sSubPr>
                 <m:ctrlPr>
@@ -7727,15 +7700,6 @@
                 </m:r>
               </m:sub>
             </m:sSub>
-            <m:r>
-              <m:rPr>
-                <m:sty m:val="p"/>
-              </m:rPr>
-              <w:rPr>
-                <w:rFonts w:ascii="Cambria Math" w:hAnsi="Cambria Math"/>
-              </w:rPr>
-              <m:t xml:space="preserve"> × </m:t>
-            </m:r>
             <m:sSub>
               <m:sSubPr>
                 <m:ctrlPr>
@@ -7761,15 +7725,6 @@
                 </m:r>
               </m:sub>
             </m:sSub>
-            <m:r>
-              <m:rPr>
-                <m:sty m:val="p"/>
-              </m:rPr>
-              <w:rPr>
-                <w:rFonts w:ascii="Cambria Math" w:hAnsi="Cambria Math"/>
-              </w:rPr>
-              <m:t xml:space="preserve">)</m:t>
-            </m:r>
           </m:e>
         </m:nary>
         <m:r>
@@ -7914,9 +7869,6 @@
         <w:t xml:space="preserve">i</w:t>
       </w:r>
       <w:r>
-        <w:t xml:space="preserve"> × </w:t>
-      </w:r>
-      <w:r>
         <w:rPr>
           <w:i/>
           <w:iCs/>
@@ -7930,9 +7882,6 @@
         <w:t xml:space="preserve">t</w:t>
       </w:r>
       <w:r>
-        <w:t xml:space="preserve"> × </w:t>
-      </w:r>
-      <w:r>
         <w:rPr>
           <w:i/>
           <w:iCs/>
@@ -7988,9 +7937,6 @@
         <w:t xml:space="preserve">si</w:t>
       </w:r>
       <w:r>
-        <w:t xml:space="preserve"> × </w:t>
-      </w:r>
-      <w:r>
         <w:rPr>
           <w:i/>
           <w:iCs/>
@@ -8050,9 +7996,6 @@
           <w:vertAlign w:val="subscript"/>
         </w:rPr>
         <w:t xml:space="preserve">i</w:t>
-      </w:r>
-      <w:r>
-        <w:t xml:space="preserve"> × </w:t>
       </w:r>
       <w:r>
         <w:rPr>
@@ -8261,15 +8204,6 @@
           </w:rPr>
           <m:t xml:space="preserve">β</m:t>
         </m:r>
-        <m:r>
-          <m:rPr>
-            <m:sty m:val="p"/>
-          </m:rPr>
-          <w:rPr>
-            <w:rFonts w:ascii="Cambria Math" w:hAnsi="Cambria Math"/>
-          </w:rPr>
-          <m:t xml:space="preserve">·</m:t>
-        </m:r>
         <m:sSub>
           <m:sSubPr>
             <m:ctrlPr>
@@ -8312,15 +8246,6 @@
             <w:rFonts w:ascii="Cambria Math" w:hAnsi="Cambria Math"/>
           </w:rPr>
           <m:t xml:space="preserve">λ</m:t>
-        </m:r>
-        <m:r>
-          <m:rPr>
-            <m:sty m:val="p"/>
-          </m:rPr>
-          <w:rPr>
-            <w:rFonts w:ascii="Cambria Math" w:hAnsi="Cambria Math"/>
-          </w:rPr>
-          <m:t xml:space="preserve">·</m:t>
         </m:r>
         <m:sSub>
           <m:sSubPr>

</xml_diff>

<commit_message>
Vòng 14: thống nhất ký hiệu công thức theo skill kinh tế lượng
Co-Authored-By: Claude Opus 5.5 <noreply@anthropic.com>
Claude-Session: https://claude.ai/code/session_012s8WfVyLuhc473yaQuJygq
</commit_message>
<xml_diff>
--- a/outputs/round-14/de-cuong-v14-round-14.docx
+++ b/outputs/round-14/de-cuong-v14-round-14.docx
@@ -7280,6 +7280,9 @@
           </m:sSubPr>
           <m:e>
             <m:r>
+              <m:rPr>
+                <m:sty m:val="p"/>
+              </m:rPr>
               <w:rPr>
                 <w:rFonts w:ascii="Cambria Math" w:hAnsi="Cambria Math"/>
               </w:rPr>
@@ -7373,65 +7376,74 @@
         <w:t xml:space="preserve">i</w:t>
       </w:r>
       <w:r>
-        <w:t xml:space="preserve"> bằng 1 nếu cổ phiếu chuyển sàn, tức mọi cổ phiếu niêm yết tại HNX được chuyển sang HOSE theo lịch của VNX, không chỉ các mã của rổ CS; </w:t>
+        <w:t xml:space="preserve"> bằng 1 nếu cổ phiếu chuyển sàn, tức mọi cổ phiếu niêm yết tại HNX được chuyển sang HOSE theo lịch của VNX, không chỉ các mã của rổ CS; Post</w:t>
+      </w:r>
+      <w:r>
+        <w:rPr>
+          <w:vertAlign w:val="subscript"/>
+        </w:rPr>
+        <w:t xml:space="preserve">t</w:t>
+      </w:r>
+      <w:r>
+        <w:t xml:space="preserve"> bằng 1 từ tháng 1/2027; </w:t>
       </w:r>
       <w:r>
         <w:rPr>
           <w:i/>
           <w:iCs/>
         </w:rPr>
-        <w:t xml:space="preserve">Post</w:t>
+        <w:t xml:space="preserve">α</w:t>
       </w:r>
       <w:r>
         <w:rPr>
           <w:vertAlign w:val="subscript"/>
         </w:rPr>
-        <w:t xml:space="preserve">t</w:t>
-      </w:r>
-      <w:r>
-        <w:t xml:space="preserve"> bằng 1 từ tháng 1/2027; </w:t>
+        <w:t xml:space="preserve">i</w:t>
+      </w:r>
+      <w:r>
+        <w:t xml:space="preserve"> và </w:t>
       </w:r>
       <w:r>
         <w:rPr>
           <w:i/>
           <w:iCs/>
         </w:rPr>
-        <w:t xml:space="preserve">α</w:t>
+        <w:t xml:space="preserve">τ</w:t>
       </w:r>
       <w:r>
         <w:rPr>
           <w:vertAlign w:val="subscript"/>
         </w:rPr>
-        <w:t xml:space="preserve">i</w:t>
-      </w:r>
-      <w:r>
-        <w:t xml:space="preserve"> và </w:t>
+        <w:t xml:space="preserve">t</w:t>
+      </w:r>
+      <w:r>
+        <w:t xml:space="preserve"> là hiệu ứng cố định theo cổ phiếu và theo tháng; </w:t>
       </w:r>
       <w:r>
         <w:rPr>
           <w:i/>
           <w:iCs/>
         </w:rPr>
-        <w:t xml:space="preserve">τ</w:t>
-      </w:r>
-      <w:r>
-        <w:rPr>
-          <w:vertAlign w:val="subscript"/>
-        </w:rPr>
-        <w:t xml:space="preserve">t</w:t>
-      </w:r>
-      <w:r>
-        <w:t xml:space="preserve"> là hiệu ứng cố định theo cổ phiếu và theo tháng; </w:t>
+        <w:t xml:space="preserve">δ</w:t>
+      </w:r>
+      <w:r>
+        <w:t xml:space="preserve"> là tác động của việc chuyển sàn; </w:t>
       </w:r>
       <w:r>
         <w:rPr>
           <w:i/>
           <w:iCs/>
         </w:rPr>
-        <w:t xml:space="preserve">δ</w:t>
-      </w:r>
-      <w:r>
-        <w:t xml:space="preserve"> là tác động của việc chuyển sàn.</w:t>
+        <w:t xml:space="preserve">ε</w:t>
+      </w:r>
+      <w:r>
+        <w:rPr>
+          <w:vertAlign w:val="subscript"/>
+        </w:rPr>
+        <w:t xml:space="preserve">it</w:t>
+      </w:r>
+      <w:r>
+        <w:t xml:space="preserve"> là sai số.</w:t>
       </w:r>
     </w:p>
     <w:p>
@@ -7869,17 +7881,29 @@
         <w:t xml:space="preserve">i</w:t>
       </w:r>
       <w:r>
+        <w:t xml:space="preserve">Post</w:t>
+      </w:r>
+      <w:r>
+        <w:rPr>
+          <w:vertAlign w:val="subscript"/>
+        </w:rPr>
+        <w:t xml:space="preserve">t</w:t>
+      </w:r>
+      <w:r>
         <w:rPr>
           <w:i/>
           <w:iCs/>
         </w:rPr>
-        <w:t xml:space="preserve">Post</w:t>
+        <w:t xml:space="preserve">E</w:t>
       </w:r>
       <w:r>
         <w:rPr>
           <w:vertAlign w:val="subscript"/>
         </w:rPr>
-        <w:t xml:space="preserve">t</w:t>
+        <w:t xml:space="preserve">si</w:t>
+      </w:r>
+      <w:r>
+        <w:t xml:space="preserve">, trong đó </w:t>
       </w:r>
       <w:r>
         <w:rPr>
@@ -7895,113 +7919,93 @@
         <w:t xml:space="preserve">si</w:t>
       </w:r>
       <w:r>
-        <w:t xml:space="preserve">, trong đó </w:t>
+        <w:t xml:space="preserve"> là mức chịu cú sốc s của cổ phiếu i, trừ trung bình và chia cho độ lệch chuẩn giữa các mã chuyển sàn, nên </w:t>
       </w:r>
       <w:r>
         <w:rPr>
           <w:i/>
           <w:iCs/>
         </w:rPr>
-        <w:t xml:space="preserve">E</w:t>
-      </w:r>
-      <w:r>
-        <w:rPr>
-          <w:vertAlign w:val="subscript"/>
-        </w:rPr>
-        <w:t xml:space="preserve">si</w:t>
-      </w:r>
-      <w:r>
-        <w:t xml:space="preserve"> là mức chịu cú sốc s của cổ phiếu i, trừ trung bình và chia cho độ lệch chuẩn giữa các mã chuyển sàn, nên </w:t>
+        <w:t xml:space="preserve">δ</w:t>
+      </w:r>
+      <w:r>
+        <w:t xml:space="preserve"> là tác động tại mức chịu cú sốc trung bình. Các số hạng </w:t>
       </w:r>
       <w:r>
         <w:rPr>
           <w:i/>
           <w:iCs/>
         </w:rPr>
-        <w:t xml:space="preserve">δ</w:t>
-      </w:r>
-      <w:r>
-        <w:t xml:space="preserve"> là tác động tại mức chịu cú sốc trung bình. Các số hạng </w:t>
+        <w:t xml:space="preserve">E</w:t>
+      </w:r>
+      <w:r>
+        <w:rPr>
+          <w:vertAlign w:val="subscript"/>
+        </w:rPr>
+        <w:t xml:space="preserve">si</w:t>
       </w:r>
       <w:r>
         <w:rPr>
           <w:i/>
           <w:iCs/>
         </w:rPr>
-        <w:t xml:space="preserve">E</w:t>
+        <w:t xml:space="preserve">τ</w:t>
       </w:r>
       <w:r>
         <w:rPr>
           <w:vertAlign w:val="subscript"/>
         </w:rPr>
-        <w:t xml:space="preserve">si</w:t>
+        <w:t xml:space="preserve">t</w:t>
+      </w:r>
+      <w:r>
+        <w:t xml:space="preserve"> cho mỗi mức chịu cú sốc một hiệu ứng theo tháng riêng, ước lượng trên mã đối chứng đo được cùng thước đo: mã UPCoM với biên độ, mã HOSE với bước giá và chỉ số. Nếu cổ phiếu UPCoM chuyển sang HOSE trước hoặc trong cửa sổ sau (mục 4.3.10), mức chịu cú sốc biên độ của mọi mã được đo bằng tỷ lệ ngày có lợi suất tuyệt đối từ ngưỡng chung trở lên và hiệu ứng theo tháng tương ứng được ước lượng trên mã HOSE đối chứng; thước đo này chỉ đại diện gần đúng cho mức chịu ràng buộc của biên độ.</w:t>
+      </w:r>
+    </w:p>
+    <w:p>
+      <w:pPr>
+        <w:pStyle w:val="BodyText"/>
+      </w:pPr>
+      <w:r>
+        <w:t xml:space="preserve">Giả định nhận dạng là: nếu không chuyển sàn, chênh lệch thanh khoản giữa mã chịu cú sốc mạnh và mã chịu cú sốc yếu trong nhóm chuyển sàn sẽ biến động như ở nhóm đối chứng; giả định này được kiểm tra bằng các hệ số trước sự kiện. Vì các mức chịu cú sốc có thể tương quan với nhau và với quy mô, hệ số tương tác không đo riêng tác động của từng quy tắc; mô hình có thêm tương tác với quy mô và với logarit Amihud ban đầu.</w:t>
+      </w:r>
+    </w:p>
+    <w:p>
+      <w:pPr>
+        <w:pStyle w:val="FirstParagraph"/>
+      </w:pPr>
+      <w:r>
+        <w:t xml:space="preserve">Mỗi hệ số tương tác được suy luận như δ, vì sai số chuẩn phân cụm theo cổ phiếu bác bỏ quá thường xuyên khi cú sốc chung theo tháng tác động mạnh hơn lên mã chịu cú sốc mạnh: với từng tháng, đề tài lấy hệ số góc của logarit Amihud theo mức chịu cú sốc ở mã chuyển sàn trừ hệ số góc ở mã đối chứng, rồi áp dụng bootstrap tự hồi quy cho chuỗi này. Các hệ số tương tác, kể cả theo trụ sở, là phân tích phụ đăng ký trước, không đưa vào thủ tục Holm.</w:t>
+      </w:r>
+    </w:p>
+    <w:p>
+      <w:pPr>
+        <w:pStyle w:val="FirstParagraph"/>
+      </w:pPr>
+      <w:r>
+        <w:t xml:space="preserve">Phân tích theo trụ sở kiểm tra xem việc chuyển sàn có tác động khác nhau đến doanh nghiệp có trụ sở tại Hà Nội và doanh nghiệp ở nơi khác hay không. Văn liệu cho thấy nhà quản lý quỹ ưa nắm giữ cổ phiếu của doanh nghiệp có trụ sở gần mình (Coval &amp; Moskowitz, 1999) và thanh khoản của cổ phiếu phụ thuộc vào vị trí trụ sở (Loughran &amp; Schultz, 2005) [CẦN ĐỐI CHIẾU bản gốc của hai bài], nhưng hai bài này nói về khoảng cách giữa nhà đầu tư và doanh nghiệp, không nói về vị trí của sàn. Kênh mà đề tài kiểm tra là sự chú ý và thông tin gắn với nơi đặt sàn: nếu kênh này có thật, cổ phiếu của doanh nghiệp có trụ sở tại Hà Nội được lợi ít hơn khi chuyển sang HOSE.</w:t>
+      </w:r>
+    </w:p>
+    <w:p>
+      <w:pPr>
+        <w:pStyle w:val="FirstParagraph"/>
+      </w:pPr>
+      <w:r>
+        <w:t xml:space="preserve">Chênh lệch này được ước lượng bằng tương tác giữa </w:t>
       </w:r>
       <w:r>
         <w:rPr>
           <w:i/>
           <w:iCs/>
         </w:rPr>
-        <w:t xml:space="preserve">τ</w:t>
+        <w:t xml:space="preserve">D</w:t>
       </w:r>
       <w:r>
         <w:rPr>
           <w:vertAlign w:val="subscript"/>
         </w:rPr>
-        <w:t xml:space="preserve">t</w:t>
-      </w:r>
-      <w:r>
-        <w:t xml:space="preserve"> cho mỗi mức chịu cú sốc một hiệu ứng theo tháng riêng, ước lượng trên mã đối chứng đo được cùng thước đo: mã UPCoM với biên độ, mã HOSE với bước giá và chỉ số. Nếu cổ phiếu UPCoM chuyển sang HOSE trước hoặc trong cửa sổ sau (mục 4.3.10), mức chịu cú sốc biên độ của mọi mã được đo bằng tỷ lệ ngày có lợi suất tuyệt đối từ ngưỡng chung trở lên và hiệu ứng theo tháng tương ứng được ước lượng trên mã HOSE đối chứng; thước đo này chỉ đại diện gần đúng cho mức chịu ràng buộc của biên độ.</w:t>
-      </w:r>
-    </w:p>
-    <w:p>
-      <w:pPr>
-        <w:pStyle w:val="BodyText"/>
-      </w:pPr>
-      <w:r>
-        <w:t xml:space="preserve">Giả định nhận dạng là: nếu không chuyển sàn, chênh lệch thanh khoản giữa mã chịu cú sốc mạnh và mã chịu cú sốc yếu trong nhóm chuyển sàn sẽ biến động như ở nhóm đối chứng; giả định này được kiểm tra bằng các hệ số trước sự kiện. Vì các mức chịu cú sốc có thể tương quan với nhau và với quy mô, hệ số tương tác không đo riêng tác động của từng quy tắc; mô hình có thêm tương tác với quy mô và với logarit Amihud ban đầu.</w:t>
-      </w:r>
-    </w:p>
-    <w:p>
-      <w:pPr>
-        <w:pStyle w:val="FirstParagraph"/>
-      </w:pPr>
-      <w:r>
-        <w:t xml:space="preserve">Mỗi hệ số tương tác được suy luận như δ, vì sai số chuẩn phân cụm theo cổ phiếu bác bỏ quá thường xuyên khi cú sốc chung theo tháng tác động mạnh hơn lên mã chịu cú sốc mạnh: với từng tháng, đề tài lấy hệ số góc của logarit Amihud theo mức chịu cú sốc ở mã chuyển sàn trừ hệ số góc ở mã đối chứng, rồi áp dụng bootstrap tự hồi quy cho chuỗi này. Các hệ số tương tác, kể cả theo trụ sở, là phân tích phụ đăng ký trước, không đưa vào thủ tục Holm.</w:t>
-      </w:r>
-    </w:p>
-    <w:p>
-      <w:pPr>
-        <w:pStyle w:val="FirstParagraph"/>
-      </w:pPr>
-      <w:r>
-        <w:t xml:space="preserve">Phân tích theo trụ sở kiểm tra xem việc chuyển sàn có tác động khác nhau đến doanh nghiệp có trụ sở tại Hà Nội và doanh nghiệp ở nơi khác hay không. Văn liệu cho thấy nhà quản lý quỹ ưa nắm giữ cổ phiếu của doanh nghiệp có trụ sở gần mình (Coval &amp; Moskowitz, 1999) và thanh khoản của cổ phiếu phụ thuộc vào vị trí trụ sở (Loughran &amp; Schultz, 2005) [CẦN ĐỐI CHIẾU bản gốc của hai bài], nhưng hai bài này nói về khoảng cách giữa nhà đầu tư và doanh nghiệp, không nói về vị trí của sàn. Kênh mà đề tài kiểm tra là sự chú ý và thông tin gắn với nơi đặt sàn: nếu kênh này có thật, cổ phiếu của doanh nghiệp có trụ sở tại Hà Nội được lợi ít hơn khi chuyển sang HOSE.</w:t>
-      </w:r>
-    </w:p>
-    <w:p>
-      <w:pPr>
-        <w:pStyle w:val="FirstParagraph"/>
-      </w:pPr>
-      <w:r>
-        <w:t xml:space="preserve">Chênh lệch này được ước lượng bằng tương tác giữa </w:t>
-      </w:r>
-      <w:r>
-        <w:rPr>
-          <w:i/>
-          <w:iCs/>
-        </w:rPr>
-        <w:t xml:space="preserve">D</w:t>
-      </w:r>
-      <w:r>
-        <w:rPr>
-          <w:vertAlign w:val="subscript"/>
-        </w:rPr>
         <w:t xml:space="preserve">i</w:t>
       </w:r>
       <w:r>
-        <w:rPr>
-          <w:i/>
-          <w:iCs/>
-        </w:rPr>
         <w:t xml:space="preserve">Post</w:t>
       </w:r>
       <w:r>
@@ -8143,7 +8147,7 @@
               <w:rPr>
                 <w:rFonts w:ascii="Cambria Math" w:hAnsi="Cambria Math"/>
               </w:rPr>
-              <m:t xml:space="preserve">γ</m:t>
+              <m:t xml:space="preserve">α</m:t>
             </m:r>
           </m:e>
           <m:sub>
@@ -8177,7 +8181,7 @@
               <w:rPr>
                 <w:rFonts w:ascii="Cambria Math" w:hAnsi="Cambria Math"/>
               </w:rPr>
-              <m:t xml:space="preserve">θ</m:t>
+              <m:t xml:space="preserve">τ</m:t>
             </m:r>
           </m:e>
           <m:sub>
@@ -8294,7 +8298,7 @@
               <w:rPr>
                 <w:rFonts w:ascii="Cambria Math" w:hAnsi="Cambria Math"/>
               </w:rPr>
-              <m:t xml:space="preserve">u</m:t>
+              <m:t xml:space="preserve">ε</m:t>
             </m:r>
           </m:e>
           <m:sub>
@@ -8334,14 +8338,23 @@
         <w:t xml:space="preserve">it</w:t>
       </w:r>
       <w:r>
-        <w:t xml:space="preserve"> là điểm GFCI của trung tâm i ở kỳ t, chuẩn hóa thành điểm z trong từng kỳ vì điểm GFCI được ước lượng lại mỗi kỳ và số trung tâm thay đổi giữa các kỳ. </w:t>
+        <w:t xml:space="preserve"> là điểm GFCI của trung tâm i ở kỳ t, chuẩn hóa thành điểm z trong từng kỳ vì điểm GFCI được ước lượng lại mỗi kỳ và số trung tâm thay đổi giữa các kỳ. SMD</w:t>
+      </w:r>
+      <w:r>
+        <w:rPr>
+          <w:vertAlign w:val="subscript"/>
+        </w:rPr>
+        <w:t xml:space="preserve">it</w:t>
+      </w:r>
+      <w:r>
+        <w:t xml:space="preserve"> là chỉ báo phát triển thị trường cổ phiếu, gộp từ tỷ lệ vòng quay và vốn hóa trên GDP (Čihák và cộng sự, 2012), còn </w:t>
       </w:r>
       <w:r>
         <w:rPr>
           <w:i/>
           <w:iCs/>
         </w:rPr>
-        <w:t xml:space="preserve">SMD</w:t>
+        <w:t xml:space="preserve">W</w:t>
       </w:r>
       <w:r>
         <w:rPr>
@@ -8350,81 +8363,81 @@
         <w:t xml:space="preserve">it</w:t>
       </w:r>
       <w:r>
-        <w:t xml:space="preserve"> là chỉ báo phát triển thị trường cổ phiếu, gộp từ tỷ lệ vòng quay và vốn hóa trên GDP (Čihák và cộng sự, 2012), còn </w:t>
+        <w:t xml:space="preserve"> gồm thu nhập bình quân đầu người và chỉ số quản trị nhà nước (Kaufmann và cộng sự, 2011); cả hai được đo ở quốc gia chứa trung tâm i, trong năm liền trước kỳ t. </w:t>
       </w:r>
       <w:r>
         <w:rPr>
           <w:i/>
           <w:iCs/>
         </w:rPr>
-        <w:t xml:space="preserve">W</w:t>
-      </w:r>
-      <w:r>
-        <w:rPr>
-          <w:vertAlign w:val="subscript"/>
-        </w:rPr>
-        <w:t xml:space="preserve">it</w:t>
-      </w:r>
-      <w:r>
-        <w:t xml:space="preserve"> gồm thu nhập bình quân đầu người và chỉ số quản trị nhà nước (Kaufmann và cộng sự, 2011); cả hai được đo ở quốc gia chứa trung tâm i, trong năm liền trước kỳ t. </w:t>
+        <w:t xml:space="preserve">λ</w:t>
+      </w:r>
+      <w:r>
+        <w:t xml:space="preserve"> là véc-tơ hệ số của </w:t>
       </w:r>
       <w:r>
         <w:rPr>
           <w:i/>
           <w:iCs/>
         </w:rPr>
-        <w:t xml:space="preserve">λ</w:t>
-      </w:r>
-      <w:r>
-        <w:t xml:space="preserve"> là véc-tơ hệ số của </w:t>
+        <w:t xml:space="preserve">W</w:t>
+      </w:r>
+      <w:r>
+        <w:rPr>
+          <w:vertAlign w:val="subscript"/>
+        </w:rPr>
+        <w:t xml:space="preserve">it</w:t>
+      </w:r>
+      <w:r>
+        <w:t xml:space="preserve">; </w:t>
       </w:r>
       <w:r>
         <w:rPr>
           <w:i/>
           <w:iCs/>
         </w:rPr>
-        <w:t xml:space="preserve">W</w:t>
+        <w:t xml:space="preserve">α</w:t>
       </w:r>
       <w:r>
         <w:rPr>
           <w:vertAlign w:val="subscript"/>
         </w:rPr>
-        <w:t xml:space="preserve">it</w:t>
-      </w:r>
-      <w:r>
-        <w:t xml:space="preserve">; </w:t>
+        <w:t xml:space="preserve">i</w:t>
+      </w:r>
+      <w:r>
+        <w:t xml:space="preserve"> và </w:t>
       </w:r>
       <w:r>
         <w:rPr>
           <w:i/>
           <w:iCs/>
         </w:rPr>
-        <w:t xml:space="preserve">γ</w:t>
+        <w:t xml:space="preserve">τ</w:t>
       </w:r>
       <w:r>
         <w:rPr>
           <w:vertAlign w:val="subscript"/>
         </w:rPr>
-        <w:t xml:space="preserve">i</w:t>
-      </w:r>
-      <w:r>
-        <w:t xml:space="preserve"> và </w:t>
+        <w:t xml:space="preserve">t</w:t>
+      </w:r>
+      <w:r>
+        <w:t xml:space="preserve"> là hiệu ứng cố định theo trung tâm và theo kỳ; </w:t>
       </w:r>
       <w:r>
         <w:rPr>
           <w:i/>
           <w:iCs/>
         </w:rPr>
-        <w:t xml:space="preserve">θ</w:t>
+        <w:t xml:space="preserve">ε</w:t>
       </w:r>
       <w:r>
         <w:rPr>
           <w:vertAlign w:val="subscript"/>
         </w:rPr>
-        <w:t xml:space="preserve">t</w:t>
-      </w:r>
-      <w:r>
-        <w:t xml:space="preserve"> là hiệu ứng cố định theo trung tâm và theo kỳ. Nếu Cơ sở dữ liệu Phát triển Tài chính Toàn cầu không phủ các năm sau 2021, đề tài dùng số liệu của Liên đoàn các Sở Giao dịch Thế giới, sau khi kiểm tra độ phủ và điều khoản sử dụng.</w:t>
+        <w:t xml:space="preserve">it</w:t>
+      </w:r>
+      <w:r>
+        <w:t xml:space="preserve"> là sai số. Nếu Cơ sở dữ liệu Phát triển Tài chính Toàn cầu không phủ các năm sau 2021, đề tài dùng số liệu của Liên đoàn các Sở Giao dịch Thế giới, sau khi kiểm tra độ phủ và điều khoản sử dụng.</w:t>
       </w:r>
     </w:p>
     <w:p>
@@ -8445,10 +8458,7 @@
         <w:t xml:space="preserve"> được xác định từ biến thiên theo thời gian trong từng quốc gia, và biến thiên này nhỏ vì </w:t>
       </w:r>
       <w:r>
-        <w:rPr>
-          <w:i/>
-          <w:iCs/>
-        </w:rPr>
+        <w:rPr/>
         <w:t xml:space="preserve">SMD</w:t>
       </w:r>
       <w:r>
@@ -8874,10 +8884,7 @@
         <w:t xml:space="preserve">, đề tài kiểm tra độ vững trên mẫu các trung tâm có ít nhất năm kỳ và trên mẫu cân bằng. Vì kỳ GFCI 40 đã có nhân tố trùng với </w:t>
       </w:r>
       <w:r>
-        <w:rPr>
-          <w:i/>
-          <w:iCs/>
-        </w:rPr>
+        <w:rPr/>
         <w:t xml:space="preserve">SMD</w:t>
       </w:r>
       <w:r>

</xml_diff>

<commit_message>
Vòng 14: gỡ 3 nhãn theo thông tin thí sinh, lưu bài TBTCO 30/9/2026
Co-Authored-By: Claude Opus 5.5 <noreply@anthropic.com>
Claude-Session: https://claude.ai/code/session_012s8WfVyLuhc473yaQuJygq
</commit_message>
<xml_diff>
--- a/outputs/round-14/de-cuong-v14-round-14.docx
+++ b/outputs/round-14/de-cuong-v14-round-14.docx
@@ -5683,7 +5683,7 @@
         <w:pStyle w:val="BodyText"/>
       </w:pPr>
       <w:r>
-        <w:t xml:space="preserve">Thí sinh đã dùng dữ liệu Việt Nam trong bài báo Nguyễn và Nguyễn (2026a) và trong các bản thảo số 4 và số 6 ở Bảng 7 [CẦN XÁC MINH phạm vi sàn của từng bài]. Để kiểm soát rủi ro chọn kết quả sau khi xem dữ liệu, thí sinh đăng ký trước kế hoạch phân tích trên OSF Registries trước ngày 28/12/2026, sau khi xin góp ý của người hướng dẫn dự kiến, và khai rõ phạm vi sàn, giai đoạn và chỉ báo đã tính trong các bài trước.</w:t>
+        <w:t xml:space="preserve">Thí sinh đã dùng dữ liệu cổ phiếu HOSE trong bài báo Nguyễn và Nguyễn (2026a) và trong các bản thảo số 4 và số 6 ở Bảng 7. Để kiểm soát rủi ro chọn kết quả sau khi xem dữ liệu, thí sinh đăng ký trước kế hoạch phân tích trên OSF Registries trước ngày 28/12/2026, sau khi xin góp ý của người hướng dẫn dự kiến, và khai rõ phạm vi sàn, giai đoạn và chỉ báo đã tính trong các bài trước.</w:t>
       </w:r>
     </w:p>
     <w:p>
@@ -9583,7 +9583,7 @@
         <w:pStyle w:val="FirstParagraph"/>
       </w:pPr>
       <w:r>
-        <w:t xml:space="preserve">Thí sinh chọn Trường Quốc tế, Đại học Quốc gia Hà Nội vì ba lý do. Thứ nhất, theo Thông báo tuyển sinh năm 2026 [CẦN BỔ SUNG số hiệu, ngày của Thông báo và mục tương ứng trong danh mục tài liệu], chương trình Tiến sĩ Kinh tế và Quản lý có tính liên ngành, tập trung vào kinh tế hành vi và quản lý trong lĩnh vực kinh tế; đề tài thuộc tài chính định lượng và giao thoa với quản lý ở phần định hướng chuyên môn hóa thị trường vốn Hà Nội.</w:t>
+        <w:t xml:space="preserve">Thí sinh chọn Trường Quốc tế, Đại học Quốc gia Hà Nội vì ba lý do. Thứ nhất, theo Thông báo tuyển sinh năm 2026, chương trình Tiến sĩ Kinh tế và Quản lý có tính liên ngành, tập trung vào kinh tế hành vi và quản lý trong lĩnh vực kinh tế; đề tài thuộc tài chính định lượng và giao thoa với quản lý ở phần định hướng chuyên môn hóa thị trường vốn Hà Nội.</w:t>
       </w:r>
     </w:p>
     <w:p>
@@ -11682,7 +11682,7 @@
         <w:pStyle w:val="Reference"/>
       </w:pPr>
       <w:r>
-        <w:t xml:space="preserve">Tuổi Trẻ Online. (2026b). Toàn bộ cổ phiếu trên HNX sẽ chuyển sang HOSE từ 28-12 [Bài báo ngày 30/9/2026] [CẦN BỔ SUNG URL].</w:t>
+        <w:t xml:space="preserve">Tuổi Trẻ Online. (2026b). Toàn bộ cổ phiếu trên HNX sẽ chuyển sang HOSE từ 28-12 [Bài báo ngày 30/9/2026]. https://tuoitre.vn/toan-bo-co-phieu-tren-hnx-se-chuyen-sang-hose-tu-28-12-100260930201353937.htm</w:t>
       </w:r>
     </w:p>
     <w:p>

</xml_diff>

<commit_message>
Vòng 14: gỡ 3 nhãn nhờ tìm kiếm (UPCoM 24/6/2009, Coval–Loughran, trang Gehrig)
Co-Authored-By: Claude Opus 5.5 <noreply@anthropic.com>
Claude-Session: https://claude.ai/code/session_012s8WfVyLuhc473yaQuJygq
</commit_message>
<xml_diff>
--- a/outputs/round-14/de-cuong-v14-round-14.docx
+++ b/outputs/round-14/de-cuong-v14-round-14.docx
@@ -4747,7 +4747,7 @@
         <w:pStyle w:val="BodyText"/>
       </w:pPr>
       <w:r>
-        <w:t xml:space="preserve">Bước giá cũng khác nhau. Với giao dịch khớp lệnh cổ phiếu, bước giá ở HOSE là 10 đồng khi giá dưới 10.000 đồng, 50 đồng khi giá từ 10.000 đến 49.950 đồng và 100 đồng từ 50.000 đồng trở lên (Sở Giao dịch Chứng khoán Thành phố Hồ Chí Minh, 2025), còn ở HNX là 100 đồng cho mọi mức giá [CẦN ĐỐI CHIẾU quy chế giao dịch gốc của HNX (Quyết định số 529/QĐ-SGDHN ngày 25/8/2016) và bước giá của HOSE trước ngày 12/9/2016]. Khi chuyển sàn, bước giá vì vậy giảm mười lần ở mã giá dưới 10.000 đồng, giảm một nửa ở mã giá từ 10.000 đến 49.950 đồng và không đổi ở mã giá cao hơn.</w:t>
+        <w:t xml:space="preserve">Bước giá cũng khác nhau. Với giao dịch khớp lệnh cổ phiếu, bước giá ở HOSE là 10 đồng khi giá dưới 10.000 đồng, 50 đồng khi giá từ 10.000 đến 49.950 đồng và 100 đồng từ 50.000 đồng trở lên (Sở Giao dịch Chứng khoán Thành phố Hồ Chí Minh, 2025), còn ở HNX là 100 đồng cho mọi mức giá [CẦN ĐỐI CHIẾU quy chế giao dịch gốc của HNX (Quyết định số 529/QĐ-SGDHN ngày 25/8/2016) và của HOSE (Quyết định số 341/QĐ-SGDHCM ngày 22/8/2016)]. Khi chuyển sàn, bước giá vì vậy giảm mười lần ở mã giá dưới 10.000 đồng, giảm một nửa ở mã giá từ 10.000 đến 49.950 đồng và không đổi ở mã giá cao hơn.</w:t>
       </w:r>
     </w:p>
     <w:p>
@@ -4877,7 +4877,7 @@
         <w:pStyle w:val="BodyText"/>
       </w:pPr>
       <w:r>
-        <w:t xml:space="preserve">Mẫu bắt đầu từ tháng 6/2009, khi UPCoM bắt đầu có giao dịch [CẦN XÁC MINH ngày giao dịch đầu tiên của UPCoM trên văn bản của HNX]. Vì HNX ngừng tiếp nhận hồ sơ đăng ký niêm yết cổ phiếu mới từ ngày 01/7/2025 (Bộ Tài chính, 2023), giai đoạn tham chiếu kết thúc ngày 30/6/2025. Giai đoạn từ tháng 7/2025 đến tháng 12/2026 là giai đoạn chuyển tiếp, được báo cáo riêng (phiên bản nghiên cứu sự kiện và phần mô tả), không dùng trong các kiểm định chính; giai đoạn sau sự kiện kéo dài 24 tháng từ tháng 1/2027.</w:t>
+        <w:t xml:space="preserve">Mẫu bắt đầu từ tháng 6/2009, khi UPCoM khai trương (ngày 24/6/2009). Vì HNX ngừng tiếp nhận hồ sơ đăng ký niêm yết cổ phiếu mới từ ngày 01/7/2025 (Bộ Tài chính, 2023), giai đoạn tham chiếu kết thúc ngày 30/6/2025. Giai đoạn từ tháng 7/2025 đến tháng 12/2026 là giai đoạn chuyển tiếp, được báo cáo riêng (phiên bản nghiên cứu sự kiện và phần mô tả), không dùng trong các kiểm định chính; giai đoạn sau sự kiện kéo dài 24 tháng từ tháng 1/2027.</w:t>
       </w:r>
     </w:p>
     <w:p>
@@ -7982,7 +7982,7 @@
         <w:pStyle w:val="FirstParagraph"/>
       </w:pPr>
       <w:r>
-        <w:t xml:space="preserve">Phân tích theo trụ sở kiểm tra xem việc chuyển sàn có tác động khác nhau đến doanh nghiệp có trụ sở tại Hà Nội và doanh nghiệp ở nơi khác hay không. Văn liệu cho thấy nhà quản lý quỹ ưa nắm giữ cổ phiếu của doanh nghiệp có trụ sở gần mình (Coval &amp; Moskowitz, 1999) và thanh khoản của cổ phiếu phụ thuộc vào vị trí trụ sở (Loughran &amp; Schultz, 2005) [CẦN ĐỐI CHIẾU bản gốc của hai bài], nhưng hai bài này nói về khoảng cách giữa nhà đầu tư và doanh nghiệp, không nói về vị trí của sàn. Kênh mà đề tài kiểm tra là sự chú ý và thông tin gắn với nơi đặt sàn: nếu kênh này có thật, cổ phiếu của doanh nghiệp có trụ sở tại Hà Nội được lợi ít hơn khi chuyển sang HOSE.</w:t>
+        <w:t xml:space="preserve">Phân tích theo trụ sở kiểm tra xem việc chuyển sàn có tác động khác nhau đến doanh nghiệp có trụ sở tại Hà Nội và doanh nghiệp ở nơi khác hay không. Văn liệu cho thấy nhà quản lý quỹ ưa nắm giữ cổ phiếu của doanh nghiệp có trụ sở gần mình (Coval &amp; Moskowitz, 1999) và thanh khoản của cổ phiếu phụ thuộc vào vị trí trụ sở (Loughran &amp; Schultz, 2005), nhưng hai bài này nói về khoảng cách giữa nhà đầu tư và doanh nghiệp, không nói về vị trí của sàn. Kênh mà đề tài kiểm tra là sự chú ý và thông tin gắn với nơi đặt sàn: nếu kênh này có thật, cổ phiếu của doanh nghiệp có trụ sở tại Hà Nội được lợi ít hơn khi chuyển sang HOSE.</w:t>
       </w:r>
     </w:p>
     <w:p>
@@ -12102,27 +12102,27 @@
         <w:pStyle w:val="Reference"/>
       </w:pPr>
       <w:r>
-        <w:t xml:space="preserve">Coval, J. D., &amp; Moskowitz, T. J. (1999). Home bias at home: Local equity preference in domestic portfolios. </w:t>
+        <w:t xml:space="preserve">Coval, J. D., &amp; Moskowitz, T. J. (1999). Home bias at home: Local equity preference in domestic portfolios. The Journal of Finance, 54(6), 2045–2073. https://doi.org/10.1111/0022-1082.00181</w:t>
       </w:r>
       <w:r>
         <w:rPr>
           <w:i/>
           <w:iCs/>
         </w:rPr>
-        <w:t xml:space="preserve">The Journal of Finance</w:t>
-      </w:r>
-      <w:r>
-        <w:t xml:space="preserve">, </w:t>
+        <w:t xml:space="preserve"/>
+      </w:r>
+      <w:r>
+        <w:t xml:space="preserve"/>
       </w:r>
       <w:r>
         <w:rPr>
           <w:i/>
           <w:iCs/>
         </w:rPr>
-        <w:t xml:space="preserve">54</w:t>
-      </w:r>
-      <w:r>
-        <w:t xml:space="preserve">(6), 2045–2073.</w:t>
+        <w:t xml:space="preserve"/>
+      </w:r>
+      <w:r>
+        <w:t xml:space="preserve"/>
       </w:r>
     </w:p>
     <w:p>
@@ -12362,7 +12362,7 @@
         <w:t xml:space="preserve">Economics of cities: Theoretical perspectives</w:t>
       </w:r>
       <w:r>
-        <w:t xml:space="preserve"> (pp. [CẦN BỔ SUNG số trang]). Cambridge University Press.</w:t>
+        <w:t xml:space="preserve"> (pp. 415–445). Cambridge University Press.</w:t>
       </w:r>
     </w:p>
     <w:p>

</xml_diff>

<commit_message>
Vòng 14: đối chiếu QĐ 529/QĐ-SGDHN, dẫn bước giá HNX theo văn bản gốc
Co-Authored-By: Claude Opus 5.5 <noreply@anthropic.com>
Claude-Session: https://claude.ai/code/session_012s8WfVyLuhc473yaQuJygq
</commit_message>
<xml_diff>
--- a/outputs/round-14/de-cuong-v14-round-14.docx
+++ b/outputs/round-14/de-cuong-v14-round-14.docx
@@ -4747,7 +4747,7 @@
         <w:pStyle w:val="BodyText"/>
       </w:pPr>
       <w:r>
-        <w:t xml:space="preserve">Bước giá cũng khác nhau. Với giao dịch khớp lệnh cổ phiếu, bước giá ở HOSE là 10 đồng khi giá dưới 10.000 đồng, 50 đồng khi giá từ 10.000 đến 49.950 đồng và 100 đồng từ 50.000 đồng trở lên (Sở Giao dịch Chứng khoán Thành phố Hồ Chí Minh, 2025), còn ở HNX là 100 đồng cho mọi mức giá [CẦN ĐỐI CHIẾU quy chế giao dịch gốc của HNX (Quyết định số 529/QĐ-SGDHN ngày 25/8/2016) và của HOSE (Quyết định số 341/QĐ-SGDHCM ngày 22/8/2016)]. Khi chuyển sàn, bước giá vì vậy giảm mười lần ở mã giá dưới 10.000 đồng, giảm một nửa ở mã giá từ 10.000 đến 49.950 đồng và không đổi ở mã giá cao hơn.</w:t>
+        <w:t xml:space="preserve">Bước giá cũng khác nhau. Với giao dịch khớp lệnh cổ phiếu, bước giá ở HOSE là 10 đồng khi giá dưới 10.000 đồng, 50 đồng khi giá từ 10.000 đến 49.950 đồng và 100 đồng từ 50.000 đồng trở lên (Sở Giao dịch Chứng khoán Thành phố Hồ Chí Minh, 2025), còn ở HNX là 100 đồng cho mọi mức giá (Sở Giao dịch Chứng khoán Hà Nội, 2016, Điều 23) [CẦN ĐỐI CHIẾU bước giá của HOSE trước ngày 12/9/2016 trên Quyết định số 341/QĐ-SGDHCM ngày 22/8/2016]. Khi chuyển sàn, bước giá vì vậy giảm mười lần ở mã giá dưới 10.000 đồng, giảm một nửa ở mã giá từ 10.000 đến 49.950 đồng và không đổi ở mã giá cao hơn.</w:t>
       </w:r>
     </w:p>
     <w:p>
@@ -11582,6 +11582,24 @@
           <w:iCs/>
         </w:rPr>
         <w:t xml:space="preserve">Nghị quyết số 222/2025/QH15 ngày 27/6/2025 về Trung tâm tài chính quốc tế tại Việt Nam</w:t>
+      </w:r>
+      <w:r>
+        <w:t xml:space="preserve">.</w:t>
+      </w:r>
+    </w:p>
+    <w:p>
+      <w:pPr>
+        <w:pStyle w:val="Reference"/>
+      </w:pPr>
+      <w:r>
+        <w:t xml:space="preserve">Sở Giao dịch Chứng khoán Hà Nội. (2016). </w:t>
+      </w:r>
+      <w:r>
+        <w:rPr>
+          <w:i/>
+          <w:iCs/>
+        </w:rPr>
+        <w:t xml:space="preserve">Quyết định số 529/QĐ-SGDHN ngày 25/8/2016 về việc ban hành Quy chế giao dịch chứng khoán niêm yết tại Sở Giao dịch Chứng khoán Hà Nội</w:t>
       </w:r>
       <w:r>
         <w:t xml:space="preserve">.</w:t>

</xml_diff>

<commit_message>
Vòng 14: gỡ hết nhãn xác minh, thêm QĐ 341 và link QĐ 737
Co-Authored-By: Claude Opus 5.5 <noreply@anthropic.com>
Claude-Session: https://claude.ai/code/session_012s8WfVyLuhc473yaQuJygq
</commit_message>
<xml_diff>
--- a/outputs/round-14/de-cuong-v14-round-14.docx
+++ b/outputs/round-14/de-cuong-v14-round-14.docx
@@ -2429,7 +2429,7 @@
         <w:pStyle w:val="BodyText"/>
       </w:pPr>
       <w:r>
-        <w:t xml:space="preserve">Hạn chuyển cổ phiếu UPCoM sang HOSE cũng là hết ngày 31/12/2026, do Thông tư số 69/2023/TT-BTC đặt và không bị Thông tư số 139/2025/TT-BTC sửa (Bộ Tài chính, 2023, 2025). Tuy vậy, thông báo của VNX chỉ áp dụng cho cổ phiếu niêm yết; báo chí cho biết cổ phiếu UPCoM không thuộc diện chuyển trong đợt này (Báo Đầu tư Chứng khoán, 2026), và chưa có văn bản công bố lịch chuyển cổ phiếu UPCoM [CẦN XÁC MINH kế hoạch chuyển cổ phiếu đăng ký giao dịch theo khoản 4 Điều 4 Thông tư số 57/2021/TT-BTC].</w:t>
+        <w:t xml:space="preserve">Hạn chuyển cổ phiếu UPCoM sang HOSE cũng là hết ngày 31/12/2026, do Thông tư số 69/2023/TT-BTC đặt và không bị Thông tư số 139/2025/TT-BTC sửa (Bộ Tài chính, 2023, 2025). Tuy vậy, thông báo của VNX chỉ áp dụng cho cổ phiếu niêm yết; báo chí cho biết cổ phiếu UPCoM không thuộc diện chuyển trong đợt này (Báo Đầu tư Chứng khoán, 2026), và đến ngày 17/10/2026 chưa có văn bản công bố lịch chuyển cổ phiếu UPCoM; đề tài sẽ cập nhật lịch này khi VNX công bố (mục 4.3.10).</w:t>
       </w:r>
     </w:p>
     <w:p>
@@ -2674,7 +2674,7 @@
         <w:pStyle w:val="BodyText"/>
       </w:pPr>
       <w:r>
-        <w:t xml:space="preserve">(6) Báo cáo định hướng chuyên môn hóa cho các thị trường do HNX tiếp tục vận hành, gửi Sở Khoa học và Công nghệ Hà Nội trong năm thứ tư, kèm văn bản xác nhận nhu cầu sử dụng kết quả của ít nhất một đơn vị, ưu tiên HNX.</w:t>
+        <w:t xml:space="preserve">(6) Báo cáo định hướng chuyên môn hóa cho các thị trường do HNX tiếp tục vận hành, gửi Sở Khoa học và Công nghệ Hà Nội trong năm thứ tư, kèm văn bản xác nhận hoặc cam kết sử dụng kết quả của ít nhất một đơn vị, ưu tiên HNX.</w:t>
       </w:r>
     </w:p>
     <w:p>
@@ -4739,7 +4739,7 @@
         <w:t xml:space="preserve">2</w:t>
       </w:r>
       <w:r>
-        <w:t xml:space="preserve">, chênh lệch có thể do quy mô doanh nghiệp và do biên độ dao động giá, hiện là ±7% ở HOSE, ±10% ở HNX và ±15% ở UPCoM; theo Điều 4 Thông tư số 120/2020/TT-BTC, biên độ do VNX quyết định sau khi Ủy ban Chứng khoán Nhà nước chấp thuận, và Ủy ban có thể điều chỉnh khi cần ổn định thị trường (Bộ Tài chính, 2020) [CẦN XÁC MINH các lần thay đổi biên độ trong giai đoạn 2009–2025]. Vì vậy, chỉ số được so sánh trên mẫu đối sánh theo quy mô và ngành, và được tính lại khi bỏ hai chỉ báo bị biên độ cắt trực tiếp là độ phi thanh khoản Amihud và chênh lệch Corwin–Schultz; tỷ số phương sai và độ trễ giá chỉ chịu biên độ gián tiếp và được kiểm tra bằng phép tính lại khi bỏ chiều hiệu quả thông tin (mục 4.3.4).</w:t>
+        <w:t xml:space="preserve">, chênh lệch có thể do quy mô doanh nghiệp và do biên độ dao động giá, hiện là ±7% ở HOSE, ±10% ở HNX và ±15% ở UPCoM; theo Điều 4 Thông tư số 120/2020/TT-BTC, biên độ do VNX quyết định sau khi Ủy ban Chứng khoán Nhà nước chấp thuận, và Ủy ban có thể điều chỉnh khi cần ổn định thị trường (Bộ Tài chính, 2020). Trong quý 1 năm thứ nhất, đề tài lập bảng biên độ và bước giá hiệu lực theo từng thời kỳ 2009–2025 từ các quyết định của HOSE, HNX và Ủy ban Chứng khoán Nhà nước, và tính các chỉ báo theo đúng quy định của từng thời kỳ. Vì vậy, chỉ số được so sánh trên mẫu đối sánh theo quy mô và ngành, và được tính lại khi bỏ hai chỉ báo bị biên độ cắt trực tiếp là độ phi thanh khoản Amihud và chênh lệch Corwin–Schultz; tỷ số phương sai và độ trễ giá chỉ chịu biên độ gián tiếp và được kiểm tra bằng phép tính lại khi bỏ chiều hiệu quả thông tin (mục 4.3.4).</w:t>
       </w:r>
     </w:p>
     <w:p>
@@ -4747,7 +4747,7 @@
         <w:pStyle w:val="BodyText"/>
       </w:pPr>
       <w:r>
-        <w:t xml:space="preserve">Bước giá cũng khác nhau. Với giao dịch khớp lệnh cổ phiếu, bước giá ở HOSE là 10 đồng khi giá dưới 10.000 đồng, 50 đồng khi giá từ 10.000 đến 49.950 đồng và 100 đồng từ 50.000 đồng trở lên (Sở Giao dịch Chứng khoán Thành phố Hồ Chí Minh, 2025), còn ở HNX là 100 đồng cho mọi mức giá (Sở Giao dịch Chứng khoán Hà Nội, 2016, Điều 23) [CẦN ĐỐI CHIẾU bước giá của HOSE trước ngày 12/9/2016 trên Quyết định số 341/QĐ-SGDHCM ngày 22/8/2016]. Khi chuyển sàn, bước giá vì vậy giảm mười lần ở mã giá dưới 10.000 đồng, giảm một nửa ở mã giá từ 10.000 đến 49.950 đồng và không đổi ở mã giá cao hơn.</w:t>
+        <w:t xml:space="preserve">Bước giá cũng khác nhau. Với giao dịch khớp lệnh cổ phiếu, bước giá ở HOSE là 10 đồng khi giá dưới 10.000 đồng, 50 đồng khi giá từ 10.000 đến 49.950 đồng và 100 đồng từ 50.000 đồng trở lên (Sở Giao dịch Chứng khoán Thành phố Hồ Chí Minh, 2025), còn ở HNX là 100 đồng cho mọi mức giá (Sở Giao dịch Chứng khoán Hà Nội, 2016, Điều 23). Bảng bước giá hiện hành của HOSE áp dụng từ ngày 12/9/2016 theo quy chế giao dịch ban hành kèm Quyết định số 341/QĐ-SGDHCM (Sở Giao dịch Chứng khoán Thành phố Hồ Chí Minh, 2016). Khi chuyển sàn, bước giá vì vậy giảm mười lần ở mã giá dưới 10.000 đồng, giảm một nửa ở mã giá từ 10.000 đến 49.950 đồng và không đổi ở mã giá cao hơn.</w:t>
       </w:r>
     </w:p>
     <w:p>
@@ -7841,7 +7841,7 @@
         <w:pStyle w:val="FirstParagraph"/>
       </w:pPr>
       <w:r>
-        <w:t xml:space="preserve">Việc chuyển sàn đổi nhiều quy tắc cùng lúc, trong đó ba quy tắc tác động mạnh yếu khác nhau tùy cổ phiếu: biên độ hẹp lại chỉ ràng buộc mã thường có lợi suất ngày lớn; bước giá nhỏ đi chủ yếu ở mã giá thấp; việc vào VN-Index và các chỉ số khác của HOSE tạo áp lực cầu lớn hơn ở mã có vốn hóa lớn so với giá trị giao dịch [CẦN XÁC MINH cách HOSE xử lý mã chuyển sàn trong các chỉ số].</w:t>
+        <w:t xml:space="preserve">Việc chuyển sàn đổi nhiều quy tắc cùng lúc, trong đó ba quy tắc tác động mạnh yếu khác nhau tùy cổ phiếu: biên độ hẹp lại chỉ ràng buộc mã thường có lợi suất ngày lớn; bước giá nhỏ đi chủ yếu ở mã giá thấp; việc vào VN-Index và các chỉ số khác của HOSE tạo áp lực cầu lớn hơn ở mã có vốn hóa lớn so với giá trị giao dịch (mục 4.3.8).</w:t>
       </w:r>
     </w:p>
     <w:p>
@@ -8539,7 +8539,7 @@
         <w:pStyle w:val="FirstParagraph"/>
       </w:pPr>
       <w:r>
-        <w:t xml:space="preserve">Thứ hai, nhóm đối chứng không chịu tác động của sự kiện. Nhóm đối chứng HOSE chịu ba thay đổi trùng thời gian: FTSE Russell đưa cổ phiếu Việt Nam vào chỉ số theo bốn đợt từ tháng 9/2026 đến tháng 9/2027 (FTSE Russell, 2026b); HOSE dự kiến công bố phân loại cổ phiếu vào Bảng Chính và Bảng Tiêu chuẩn lần đầu ngày 28/12/2026, theo dự thảo quy chế đang lấy ý kiến (Tuổi Trẻ Online, 2026a); và VN-Index, vốn tự động cập nhật danh mục sau ngày giao dịch đầu tiên của cổ phiếu niêm yết mới (Sở Giao dịch Chứng khoán Thành phố Hồ Chí Minh, 2026), nhiều khả năng nhận các mã chuyển sàn từ phiên thứ hai trên HOSE [CẦN XÁC MINH quy chế phân bảng chính thức; cách xử lý mã chuyển sàn trong VN-Index xem nhãn ở mục 4.3.7].</w:t>
+        <w:t xml:space="preserve">Thứ hai, nhóm đối chứng không chịu tác động của sự kiện. Nhóm đối chứng HOSE chịu ba thay đổi trùng thời gian: FTSE Russell đưa cổ phiếu Việt Nam vào chỉ số theo bốn đợt từ tháng 9/2026 đến tháng 9/2027 (FTSE Russell, 2026b); HOSE dự kiến công bố phân loại cổ phiếu vào Bảng Chính và Bảng Tiêu chuẩn lần đầu ngày 28/12/2026, theo dự thảo quy chế đang lấy ý kiến (Tuổi Trẻ Online, 2026a); và VN-Index, vốn tự động cập nhật danh mục sau ngày giao dịch đầu tiên của cổ phiếu niêm yết mới (Sở Giao dịch Chứng khoán Thành phố Hồ Chí Minh, 2026), nhiều khả năng nhận các mã chuyển sàn từ phiên thứ hai trên HOSE. Ngày vào chỉ số thực tế của từng mã và quy chế phân bảng chính thức, khi được ban hành, được ghi lại từ công bố của HOSE và đưa vào ước lượng.</w:t>
       </w:r>
     </w:p>
     <w:p>
@@ -9101,7 +9101,7 @@
         <w:pStyle w:val="BodyText"/>
       </w:pPr>
       <w:r>
-        <w:t xml:space="preserve">Trước khi nộp hồ sơ đề nghị hỗ trợ, thí sinh sẽ xin văn bản xác nhận nhu cầu sử dụng kết quả của ít nhất một đơn vị trong số này, ưu tiên HNX; văn bản này cũng là căn cứ của chỉ tiêu (6).</w:t>
+        <w:t xml:space="preserve">Trước khi nộp hồ sơ đề nghị hỗ trợ, thí sinh sẽ xin văn bản xác nhận hoặc cam kết sử dụng kết quả của ít nhất một đơn vị trong số này, ưu tiên HNX; văn bản này cũng là căn cứ của chỉ tiêu (6).</w:t>
       </w:r>
     </w:p>
     <w:p>
@@ -11610,17 +11610,17 @@
         <w:pStyle w:val="Reference"/>
       </w:pPr>
       <w:r>
-        <w:t xml:space="preserve">Sở Giao dịch Chứng khoán Thành phố Hồ Chí Minh. (2025). </w:t>
+        <w:t xml:space="preserve">Sở Giao dịch Chứng khoán Thành phố Hồ Chí Minh. (2016). </w:t>
       </w:r>
       <w:r>
         <w:rPr>
           <w:i/>
           <w:iCs/>
         </w:rPr>
-        <w:t xml:space="preserve">Quy định giao dịch đăng website HOSE</w:t>
-      </w:r>
-      <w:r>
-        <w:t xml:space="preserve"> [Kèm theo Tờ trình số 51/TTr-HTGD ngày 26/4/2025].</w:t>
+        <w:t xml:space="preserve">Quyết định số 341/QĐ-SGDHCM ngày 22/8/2016 ban hành Quy chế giao dịch chứng khoán</w:t>
+      </w:r>
+      <w:r>
+        <w:t xml:space="preserve">.</w:t>
       </w:r>
     </w:p>
     <w:p>
@@ -11628,17 +11628,35 @@
         <w:pStyle w:val="Reference"/>
       </w:pPr>
       <w:r>
-        <w:t xml:space="preserve">Sở Giao dịch Chứng khoán Thành phố Hồ Chí Minh. (2026). </w:t>
+        <w:t xml:space="preserve">Sở Giao dịch Chứng khoán Thành phố Hồ Chí Minh. (2025). </w:t>
       </w:r>
       <w:r>
         <w:rPr>
           <w:i/>
           <w:iCs/>
         </w:rPr>
-        <w:t xml:space="preserve">Quyết định số 737/QĐ-SGDHCM ngày 29/9/2026 ban hành Quy tắc chỉ số VNINDEX phiên bản 1.0</w:t>
-      </w:r>
-      <w:r>
-        <w:t xml:space="preserve"> [CẦN XÁC MINH số hiệu và ngày trên bản gốc; bản OCR chỉ đọc được tháng 9/2026].</w:t>
+        <w:t xml:space="preserve">Quy định giao dịch đăng website HOSE</w:t>
+      </w:r>
+      <w:r>
+        <w:t xml:space="preserve"> [Kèm theo Tờ trình số 51/TTr-HTGD ngày 26/4/2025].</w:t>
+      </w:r>
+    </w:p>
+    <w:p>
+      <w:pPr>
+        <w:pStyle w:val="Reference"/>
+      </w:pPr>
+      <w:r>
+        <w:t xml:space="preserve">Sở Giao dịch Chứng khoán Thành phố Hồ Chí Minh. (2026). </w:t>
+      </w:r>
+      <w:r>
+        <w:rPr>
+          <w:i/>
+          <w:iCs/>
+        </w:rPr>
+        <w:t xml:space="preserve">Quyết định số 737/QĐ-SGDHCM ngày 29/9/2026 ban hành Quy tắc chỉ số VNINDEX phiên bản 1.0. https://stream.vnx.vn/VNX//Article/2026100813094820920260929_QD737_SGDHCM_QTCS-VNINDEX.pdf</w:t>
+      </w:r>
+      <w:r>
+        <w:t xml:space="preserve"/>
       </w:r>
     </w:p>
     <w:p>

</xml_diff>